<commit_message>
updated purchase order processing skills
</commit_message>
<xml_diff>
--- a/implementation_layer/no-code-assets/agent-skills/purchase-order-processing/ouput/output_report.docx
+++ b/implementation_layer/no-code-assets/agent-skills/purchase-order-processing/ouput/output_report.docx
@@ -4,7 +4,7 @@
   <w:body>
     <w:p>
       <w:pPr>
-        <w:spacing w:before="120" w:after="60"/>
+        <w:spacing w:after="100"/>
         <w:jc w:val="center"/>
       </w:pPr>
       <w:r>
@@ -19,7 +19,6 @@
     </w:p>
     <w:p>
       <w:pPr>
-        <w:spacing w:after="30"/>
         <w:jc w:val="center"/>
       </w:pPr>
       <w:r>
@@ -28,7 +27,7 @@
     </w:p>
     <w:p>
       <w:pPr>
-        <w:spacing w:after="180"/>
+        <w:spacing w:after="400"/>
         <w:jc w:val="center"/>
       </w:pPr>
       <w:r>
@@ -37,7 +36,7 @@
     </w:p>
     <w:p>
       <w:pPr>
-        <w:spacing w:before="120" w:after="180"/>
+        <w:spacing w:after="300"/>
         <w:jc w:val="center"/>
       </w:pPr>
       <w:r>
@@ -54,24 +53,22 @@
       <w:tblPr>
         <w:tblW w:w="5000" w:type="pct"/>
         <w:tblBorders>
-          <w:top w:val="single" w:sz="1" w:space="0" w:color="auto"/>
-          <w:left w:val="single" w:sz="1" w:space="0" w:color="auto"/>
-          <w:bottom w:val="single" w:sz="1" w:space="0" w:color="auto"/>
-          <w:right w:val="single" w:sz="1" w:space="0" w:color="auto"/>
-          <w:insideH w:val="single" w:sz="4" w:space="0" w:color="auto"/>
-          <w:insideV w:val="single" w:sz="4" w:space="0" w:color="auto"/>
+          <w:top w:val="single" w:sz="1" w:space="0" w:color="000000"/>
+          <w:left w:val="single" w:sz="1" w:space="0" w:color="000000"/>
+          <w:bottom w:val="single" w:sz="1" w:space="0" w:color="000000"/>
+          <w:right w:val="single" w:sz="1" w:space="0" w:color="000000"/>
+          <w:insideH w:val="single" w:sz="1" w:space="0" w:color="000000"/>
+          <w:insideV w:val="single" w:sz="1" w:space="0" w:color="000000"/>
         </w:tblBorders>
         <w:tblCellMar>
           <w:left w:w="10" w:type="dxa"/>
           <w:right w:w="10" w:type="dxa"/>
         </w:tblCellMar>
-        <w:tblLook w:val="04A0" w:firstRow="1" w:lastRow="0" w:firstColumn="1" w:lastColumn="0" w:noHBand="0" w:noVBand="1"/>
+        <w:tblLook w:val="0000" w:firstRow="0" w:lastRow="0" w:firstColumn="0" w:lastColumn="0" w:noHBand="0" w:noVBand="0"/>
       </w:tblPr>
       <w:tblGrid>
-        <w:gridCol w:w="2093"/>
-        <w:gridCol w:w="2175"/>
-        <w:gridCol w:w="2406"/>
-        <w:gridCol w:w="2684"/>
+        <w:gridCol w:w="4524"/>
+        <w:gridCol w:w="4834"/>
       </w:tblGrid>
       <w:tr>
         <w:tblPrEx>
@@ -83,18 +80,15 @@
         <w:tc>
           <w:tcPr>
             <w:tcW w:w="0" w:type="auto"/>
-            <w:tcBorders>
-              <w:top w:val="single" w:sz="1" w:space="0" w:color="auto"/>
-              <w:left w:val="single" w:sz="1" w:space="0" w:color="auto"/>
-              <w:bottom w:val="single" w:sz="1" w:space="0" w:color="auto"/>
-              <w:right w:val="single" w:sz="1" w:space="0" w:color="auto"/>
-            </w:tcBorders>
-            <w:vAlign w:val="center"/>
-          </w:tcPr>
-          <w:p>
-            <w:pPr>
-              <w:spacing w:before="60" w:after="60"/>
-            </w:pPr>
+            <w:tcMar>
+              <w:top w:w="100" w:type="dxa"/>
+              <w:left w:w="100" w:type="dxa"/>
+              <w:bottom w:w="100" w:type="dxa"/>
+              <w:right w:w="100" w:type="dxa"/>
+            </w:tcMar>
+            <w:vAlign w:val="center"/>
+          </w:tcPr>
+          <w:p>
             <w:proofErr w:type="gramStart"/>
             <w:r>
               <w:rPr>
@@ -109,71 +103,28 @@
                 <w:b/>
                 <w:bCs/>
               </w:rPr>
-              <w:t xml:space="preserve"> Number:</w:t>
-            </w:r>
-          </w:p>
-        </w:tc>
-        <w:tc>
-          <w:tcPr>
-            <w:tcW w:w="0" w:type="auto"/>
-            <w:tcBorders>
-              <w:top w:val="single" w:sz="1" w:space="0" w:color="auto"/>
-              <w:left w:val="single" w:sz="1" w:space="0" w:color="auto"/>
-              <w:bottom w:val="single" w:sz="1" w:space="0" w:color="auto"/>
-              <w:right w:val="single" w:sz="1" w:space="0" w:color="auto"/>
-            </w:tcBorders>
-            <w:vAlign w:val="center"/>
-          </w:tcPr>
-          <w:p>
-            <w:pPr>
-              <w:spacing w:before="60" w:after="60"/>
-            </w:pPr>
-            <w:r>
-              <w:t>SO-2025-15903</w:t>
-            </w:r>
-          </w:p>
-        </w:tc>
-        <w:tc>
-          <w:tcPr>
-            <w:tcW w:w="0" w:type="auto"/>
-            <w:tcBorders>
-              <w:top w:val="single" w:sz="1" w:space="0" w:color="auto"/>
-              <w:left w:val="single" w:sz="1" w:space="0" w:color="auto"/>
-              <w:bottom w:val="single" w:sz="1" w:space="0" w:color="auto"/>
-              <w:right w:val="single" w:sz="1" w:space="0" w:color="auto"/>
-            </w:tcBorders>
-            <w:vAlign w:val="center"/>
-          </w:tcPr>
-          <w:p>
-            <w:pPr>
-              <w:spacing w:before="60" w:after="60"/>
-            </w:pPr>
+              <w:t xml:space="preserve"> Number: SO-2025-15903</w:t>
+            </w:r>
+          </w:p>
+        </w:tc>
+        <w:tc>
+          <w:tcPr>
+            <w:tcW w:w="0" w:type="auto"/>
+            <w:tcMar>
+              <w:top w:w="100" w:type="dxa"/>
+              <w:left w:w="100" w:type="dxa"/>
+              <w:bottom w:w="100" w:type="dxa"/>
+              <w:right w:w="100" w:type="dxa"/>
+            </w:tcMar>
+            <w:vAlign w:val="center"/>
+          </w:tcPr>
+          <w:p>
             <w:r>
               <w:rPr>
                 <w:b/>
                 <w:bCs/>
               </w:rPr>
-              <w:t>Order Date:</w:t>
-            </w:r>
-          </w:p>
-        </w:tc>
-        <w:tc>
-          <w:tcPr>
-            <w:tcW w:w="0" w:type="auto"/>
-            <w:tcBorders>
-              <w:top w:val="single" w:sz="1" w:space="0" w:color="auto"/>
-              <w:left w:val="single" w:sz="1" w:space="0" w:color="auto"/>
-              <w:bottom w:val="single" w:sz="1" w:space="0" w:color="auto"/>
-              <w:right w:val="single" w:sz="1" w:space="0" w:color="auto"/>
-            </w:tcBorders>
-            <w:vAlign w:val="center"/>
-          </w:tcPr>
-          <w:p>
-            <w:pPr>
-              <w:spacing w:before="60" w:after="60"/>
-            </w:pPr>
-            <w:r>
-              <w:t>November 15, 2025</w:t>
+              <w:t>Order Date: February 05, 2026</w:t>
             </w:r>
           </w:p>
         </w:tc>
@@ -188,88 +139,34 @@
         <w:tc>
           <w:tcPr>
             <w:tcW w:w="0" w:type="auto"/>
-            <w:tcBorders>
-              <w:top w:val="single" w:sz="1" w:space="0" w:color="auto"/>
-              <w:left w:val="single" w:sz="1" w:space="0" w:color="auto"/>
-              <w:bottom w:val="single" w:sz="1" w:space="0" w:color="auto"/>
-              <w:right w:val="single" w:sz="1" w:space="0" w:color="auto"/>
-            </w:tcBorders>
-            <w:vAlign w:val="center"/>
-          </w:tcPr>
-          <w:p>
-            <w:pPr>
-              <w:spacing w:before="60" w:after="60"/>
-            </w:pPr>
-            <w:r>
-              <w:rPr>
-                <w:b/>
-                <w:bCs/>
-              </w:rPr>
-              <w:t>Customer PO:</w:t>
-            </w:r>
-          </w:p>
-        </w:tc>
-        <w:tc>
-          <w:tcPr>
-            <w:tcW w:w="0" w:type="auto"/>
-            <w:tcBorders>
-              <w:top w:val="single" w:sz="1" w:space="0" w:color="auto"/>
-              <w:left w:val="single" w:sz="1" w:space="0" w:color="auto"/>
-              <w:bottom w:val="single" w:sz="1" w:space="0" w:color="auto"/>
-              <w:right w:val="single" w:sz="1" w:space="0" w:color="auto"/>
-            </w:tcBorders>
-            <w:vAlign w:val="center"/>
-          </w:tcPr>
-          <w:p>
-            <w:pPr>
-              <w:spacing w:before="60" w:after="60"/>
-            </w:pPr>
-            <w:r>
-              <w:t>PO-2025-15903</w:t>
-            </w:r>
-          </w:p>
-        </w:tc>
-        <w:tc>
-          <w:tcPr>
-            <w:tcW w:w="0" w:type="auto"/>
-            <w:tcBorders>
-              <w:top w:val="single" w:sz="1" w:space="0" w:color="auto"/>
-              <w:left w:val="single" w:sz="1" w:space="0" w:color="auto"/>
-              <w:bottom w:val="single" w:sz="1" w:space="0" w:color="auto"/>
-              <w:right w:val="single" w:sz="1" w:space="0" w:color="auto"/>
-            </w:tcBorders>
-            <w:vAlign w:val="center"/>
-          </w:tcPr>
-          <w:p>
-            <w:pPr>
-              <w:spacing w:before="60" w:after="60"/>
-            </w:pPr>
-            <w:r>
-              <w:rPr>
-                <w:b/>
-                <w:bCs/>
-              </w:rPr>
-              <w:t>Payment Terms:</w:t>
-            </w:r>
-          </w:p>
-        </w:tc>
-        <w:tc>
-          <w:tcPr>
-            <w:tcW w:w="0" w:type="auto"/>
-            <w:tcBorders>
-              <w:top w:val="single" w:sz="1" w:space="0" w:color="auto"/>
-              <w:left w:val="single" w:sz="1" w:space="0" w:color="auto"/>
-              <w:bottom w:val="single" w:sz="1" w:space="0" w:color="auto"/>
-              <w:right w:val="single" w:sz="1" w:space="0" w:color="auto"/>
-            </w:tcBorders>
-            <w:vAlign w:val="center"/>
-          </w:tcPr>
-          <w:p>
-            <w:pPr>
-              <w:spacing w:before="60" w:after="60"/>
-            </w:pPr>
-            <w:r>
-              <w:t>Net 30</w:t>
+            <w:tcMar>
+              <w:top w:w="100" w:type="dxa"/>
+              <w:left w:w="100" w:type="dxa"/>
+              <w:bottom w:w="100" w:type="dxa"/>
+              <w:right w:w="100" w:type="dxa"/>
+            </w:tcMar>
+            <w:vAlign w:val="center"/>
+          </w:tcPr>
+          <w:p>
+            <w:r>
+              <w:t>Customer PO: PO-2025-15903</w:t>
+            </w:r>
+          </w:p>
+        </w:tc>
+        <w:tc>
+          <w:tcPr>
+            <w:tcW w:w="0" w:type="auto"/>
+            <w:tcMar>
+              <w:top w:w="100" w:type="dxa"/>
+              <w:left w:w="100" w:type="dxa"/>
+              <w:bottom w:w="100" w:type="dxa"/>
+              <w:right w:w="100" w:type="dxa"/>
+            </w:tcMar>
+            <w:vAlign w:val="center"/>
+          </w:tcPr>
+          <w:p>
+            <w:r>
+              <w:t>Payment Terms: Net 30</w:t>
             </w:r>
           </w:p>
         </w:tc>
@@ -277,7 +174,7 @@
     </w:tbl>
     <w:p>
       <w:pPr>
-        <w:spacing w:before="240" w:after="120"/>
+        <w:spacing w:before="120" w:after="120"/>
       </w:pPr>
       <w:r>
         <w:rPr>
@@ -293,22 +190,22 @@
       <w:tblPr>
         <w:tblW w:w="5000" w:type="pct"/>
         <w:tblBorders>
-          <w:top w:val="single" w:sz="1" w:space="0" w:color="auto"/>
-          <w:left w:val="single" w:sz="1" w:space="0" w:color="auto"/>
-          <w:bottom w:val="single" w:sz="1" w:space="0" w:color="auto"/>
-          <w:right w:val="single" w:sz="1" w:space="0" w:color="auto"/>
-          <w:insideH w:val="single" w:sz="4" w:space="0" w:color="auto"/>
-          <w:insideV w:val="single" w:sz="4" w:space="0" w:color="auto"/>
+          <w:top w:val="single" w:sz="1" w:space="0" w:color="000000"/>
+          <w:left w:val="single" w:sz="1" w:space="0" w:color="000000"/>
+          <w:bottom w:val="single" w:sz="1" w:space="0" w:color="000000"/>
+          <w:right w:val="single" w:sz="1" w:space="0" w:color="000000"/>
+          <w:insideH w:val="single" w:sz="1" w:space="0" w:color="000000"/>
+          <w:insideV w:val="single" w:sz="1" w:space="0" w:color="000000"/>
         </w:tblBorders>
         <w:tblCellMar>
           <w:left w:w="10" w:type="dxa"/>
           <w:right w:w="10" w:type="dxa"/>
         </w:tblCellMar>
-        <w:tblLook w:val="04A0" w:firstRow="1" w:lastRow="0" w:firstColumn="1" w:lastColumn="0" w:noHBand="0" w:noVBand="1"/>
+        <w:tblLook w:val="0000" w:firstRow="0" w:lastRow="0" w:firstColumn="0" w:lastColumn="0" w:noHBand="0" w:noVBand="0"/>
       </w:tblPr>
       <w:tblGrid>
-        <w:gridCol w:w="4679"/>
-        <w:gridCol w:w="4679"/>
+        <w:gridCol w:w="4487"/>
+        <w:gridCol w:w="4871"/>
       </w:tblGrid>
       <w:tr>
         <w:tblPrEx>
@@ -319,12 +216,16 @@
         </w:tblPrEx>
         <w:tc>
           <w:tcPr>
-            <w:tcW w:w="2500" w:type="pct"/>
-          </w:tcPr>
-          <w:p>
-            <w:pPr>
-              <w:spacing w:after="60"/>
-            </w:pPr>
+            <w:tcW w:w="0" w:type="auto"/>
+            <w:tcMar>
+              <w:top w:w="100" w:type="dxa"/>
+              <w:left w:w="100" w:type="dxa"/>
+              <w:bottom w:w="100" w:type="dxa"/>
+              <w:right w:w="100" w:type="dxa"/>
+            </w:tcMar>
+            <w:vAlign w:val="center"/>
+          </w:tcPr>
+          <w:p>
             <w:r>
               <w:rPr>
                 <w:b/>
@@ -333,49 +234,19 @@
               <w:t>Bill To:</w:t>
             </w:r>
           </w:p>
-          <w:p>
-            <w:pPr>
-              <w:spacing w:after="60"/>
-            </w:pPr>
-            <w:proofErr w:type="spellStart"/>
-            <w:r>
-              <w:t>AutoTech</w:t>
-            </w:r>
-            <w:proofErr w:type="spellEnd"/>
-            <w:r>
-              <w:t xml:space="preserve"> Manufacturing Corp.</w:t>
-            </w:r>
-          </w:p>
-          <w:p>
-            <w:pPr>
-              <w:spacing w:after="60"/>
-            </w:pPr>
-            <w:r>
-              <w:t>2750 Industrial Parkway, Detroit, MI 48201</w:t>
-            </w:r>
-          </w:p>
-          <w:p>
-            <w:pPr>
-              <w:spacing w:after="60"/>
-            </w:pPr>
-            <w:r>
-              <w:t>Contact: Patricia Henderson</w:t>
-            </w:r>
-          </w:p>
-          <w:p>
-            <w:r>
-              <w:t>Tel: +1 (313) 555-4200</w:t>
-            </w:r>
-          </w:p>
-        </w:tc>
-        <w:tc>
-          <w:tcPr>
-            <w:tcW w:w="2500" w:type="pct"/>
-          </w:tcPr>
-          <w:p>
-            <w:pPr>
-              <w:spacing w:after="60"/>
-            </w:pPr>
+        </w:tc>
+        <w:tc>
+          <w:tcPr>
+            <w:tcW w:w="0" w:type="auto"/>
+            <w:tcMar>
+              <w:top w:w="100" w:type="dxa"/>
+              <w:left w:w="100" w:type="dxa"/>
+              <w:bottom w:w="100" w:type="dxa"/>
+              <w:right w:w="100" w:type="dxa"/>
+            </w:tcMar>
+            <w:vAlign w:val="center"/>
+          </w:tcPr>
+          <w:p>
             <w:r>
               <w:rPr>
                 <w:b/>
@@ -384,9 +255,72 @@
               <w:t>Ship To:</w:t>
             </w:r>
           </w:p>
-          <w:p>
-            <w:r>
-              <w:t>SAME AS BILL TO</w:t>
+        </w:tc>
+      </w:tr>
+      <w:tr>
+        <w:tblPrEx>
+          <w:tblCellMar>
+            <w:top w:w="0" w:type="dxa"/>
+            <w:bottom w:w="0" w:type="dxa"/>
+          </w:tblCellMar>
+        </w:tblPrEx>
+        <w:tc>
+          <w:tcPr>
+            <w:tcW w:w="0" w:type="auto"/>
+            <w:tcMar>
+              <w:top w:w="100" w:type="dxa"/>
+              <w:left w:w="100" w:type="dxa"/>
+              <w:bottom w:w="100" w:type="dxa"/>
+              <w:right w:w="100" w:type="dxa"/>
+            </w:tcMar>
+            <w:vAlign w:val="center"/>
+          </w:tcPr>
+          <w:p>
+            <w:proofErr w:type="spellStart"/>
+            <w:r>
+              <w:t>AutoTech</w:t>
+            </w:r>
+            <w:proofErr w:type="spellEnd"/>
+            <w:r>
+              <w:t xml:space="preserve"> Manufacturing Corp.  2750 Industrial Parkway, Detroit, MI </w:t>
+            </w:r>
+            <w:proofErr w:type="gramStart"/>
+            <w:r>
+              <w:t>48201  Tel</w:t>
+            </w:r>
+            <w:proofErr w:type="gramEnd"/>
+            <w:r>
+              <w:t>: +1 (313) 555-4200</w:t>
+            </w:r>
+          </w:p>
+        </w:tc>
+        <w:tc>
+          <w:tcPr>
+            <w:tcW w:w="0" w:type="auto"/>
+            <w:tcMar>
+              <w:top w:w="100" w:type="dxa"/>
+              <w:left w:w="100" w:type="dxa"/>
+              <w:bottom w:w="100" w:type="dxa"/>
+              <w:right w:w="100" w:type="dxa"/>
+            </w:tcMar>
+            <w:vAlign w:val="center"/>
+          </w:tcPr>
+          <w:p>
+            <w:proofErr w:type="spellStart"/>
+            <w:r>
+              <w:t>AutoTech</w:t>
+            </w:r>
+            <w:proofErr w:type="spellEnd"/>
+            <w:r>
+              <w:t xml:space="preserve"> Manufacturing Corp.  2750 Industrial Parkway, Detroit, MI </w:t>
+            </w:r>
+            <w:proofErr w:type="gramStart"/>
+            <w:r>
+              <w:t>48201  Shipping</w:t>
+            </w:r>
+            <w:proofErr w:type="gramEnd"/>
+            <w:r>
+              <w:t xml:space="preserve"> Terms: FOB Destination</w:t>
             </w:r>
           </w:p>
         </w:tc>
@@ -394,7 +328,13 @@
     </w:tbl>
     <w:p>
       <w:pPr>
-        <w:spacing w:before="240" w:after="120"/>
+        <w:spacing w:before="120" w:after="120"/>
+        <w:rPr>
+          <w:b/>
+          <w:bCs/>
+          <w:sz w:val="24"/>
+          <w:szCs w:val="24"/>
+        </w:rPr>
       </w:pPr>
       <w:r>
         <w:rPr>
@@ -410,28 +350,28 @@
       <w:tblPr>
         <w:tblW w:w="5000" w:type="pct"/>
         <w:tblBorders>
-          <w:top w:val="single" w:sz="1" w:space="0" w:color="auto"/>
-          <w:left w:val="single" w:sz="1" w:space="0" w:color="auto"/>
-          <w:bottom w:val="single" w:sz="1" w:space="0" w:color="auto"/>
-          <w:right w:val="single" w:sz="1" w:space="0" w:color="auto"/>
-          <w:insideH w:val="single" w:sz="4" w:space="0" w:color="auto"/>
-          <w:insideV w:val="single" w:sz="4" w:space="0" w:color="auto"/>
+          <w:top w:val="single" w:sz="1" w:space="0" w:color="000000"/>
+          <w:left w:val="single" w:sz="1" w:space="0" w:color="000000"/>
+          <w:bottom w:val="single" w:sz="1" w:space="0" w:color="000000"/>
+          <w:right w:val="single" w:sz="1" w:space="0" w:color="000000"/>
+          <w:insideH w:val="single" w:sz="1" w:space="0" w:color="000000"/>
+          <w:insideV w:val="single" w:sz="1" w:space="0" w:color="000000"/>
         </w:tblBorders>
         <w:tblCellMar>
           <w:left w:w="10" w:type="dxa"/>
           <w:right w:w="10" w:type="dxa"/>
         </w:tblCellMar>
-        <w:tblLook w:val="04A0" w:firstRow="1" w:lastRow="0" w:firstColumn="1" w:lastColumn="0" w:noHBand="0" w:noVBand="1"/>
+        <w:tblLook w:val="0000" w:firstRow="0" w:lastRow="0" w:firstColumn="0" w:lastColumn="0" w:noHBand="0" w:noVBand="0"/>
       </w:tblPr>
       <w:tblGrid>
-        <w:gridCol w:w="420"/>
-        <w:gridCol w:w="656"/>
-        <w:gridCol w:w="2133"/>
-        <w:gridCol w:w="2775"/>
-        <w:gridCol w:w="343"/>
-        <w:gridCol w:w="818"/>
-        <w:gridCol w:w="870"/>
-        <w:gridCol w:w="1343"/>
+        <w:gridCol w:w="600"/>
+        <w:gridCol w:w="760"/>
+        <w:gridCol w:w="1857"/>
+        <w:gridCol w:w="2224"/>
+        <w:gridCol w:w="553"/>
+        <w:gridCol w:w="909"/>
+        <w:gridCol w:w="1139"/>
+        <w:gridCol w:w="1316"/>
       </w:tblGrid>
       <w:tr>
         <w:tblPrEx>
@@ -442,18 +382,17 @@
         </w:tblPrEx>
         <w:tc>
           <w:tcPr>
-            <w:tcW w:w="0" w:type="auto"/>
-            <w:tcBorders>
-              <w:top w:val="single" w:sz="1" w:space="0" w:color="auto"/>
-              <w:left w:val="single" w:sz="1" w:space="0" w:color="auto"/>
-              <w:bottom w:val="single" w:sz="1" w:space="0" w:color="auto"/>
-              <w:right w:val="single" w:sz="1" w:space="0" w:color="auto"/>
-            </w:tcBorders>
+            <w:tcW w:w="600" w:type="dxa"/>
+            <w:tcMar>
+              <w:top w:w="100" w:type="dxa"/>
+              <w:left w:w="100" w:type="dxa"/>
+              <w:bottom w:w="100" w:type="dxa"/>
+              <w:right w:w="100" w:type="dxa"/>
+            </w:tcMar>
             <w:vAlign w:val="center"/>
           </w:tcPr>
           <w:p>
             <w:pPr>
-              <w:spacing w:before="60" w:after="60"/>
               <w:jc w:val="center"/>
             </w:pPr>
             <w:r>
@@ -467,18 +406,17 @@
         </w:tc>
         <w:tc>
           <w:tcPr>
-            <w:tcW w:w="0" w:type="auto"/>
-            <w:tcBorders>
-              <w:top w:val="single" w:sz="1" w:space="0" w:color="auto"/>
-              <w:left w:val="single" w:sz="1" w:space="0" w:color="auto"/>
-              <w:bottom w:val="single" w:sz="1" w:space="0" w:color="auto"/>
-              <w:right w:val="single" w:sz="1" w:space="0" w:color="auto"/>
-            </w:tcBorders>
+            <w:tcW w:w="1000" w:type="dxa"/>
+            <w:tcMar>
+              <w:top w:w="100" w:type="dxa"/>
+              <w:left w:w="100" w:type="dxa"/>
+              <w:bottom w:w="100" w:type="dxa"/>
+              <w:right w:w="100" w:type="dxa"/>
+            </w:tcMar>
             <w:vAlign w:val="center"/>
           </w:tcPr>
           <w:p>
             <w:pPr>
-              <w:spacing w:before="60" w:after="60"/>
               <w:jc w:val="center"/>
             </w:pPr>
             <w:r>
@@ -492,18 +430,17 @@
         </w:tc>
         <w:tc>
           <w:tcPr>
-            <w:tcW w:w="0" w:type="auto"/>
-            <w:tcBorders>
-              <w:top w:val="single" w:sz="1" w:space="0" w:color="auto"/>
-              <w:left w:val="single" w:sz="1" w:space="0" w:color="auto"/>
-              <w:bottom w:val="single" w:sz="1" w:space="0" w:color="auto"/>
-              <w:right w:val="single" w:sz="1" w:space="0" w:color="auto"/>
-            </w:tcBorders>
+            <w:tcW w:w="2400" w:type="dxa"/>
+            <w:tcMar>
+              <w:top w:w="100" w:type="dxa"/>
+              <w:left w:w="100" w:type="dxa"/>
+              <w:bottom w:w="100" w:type="dxa"/>
+              <w:right w:w="100" w:type="dxa"/>
+            </w:tcMar>
             <w:vAlign w:val="center"/>
           </w:tcPr>
           <w:p>
             <w:pPr>
-              <w:spacing w:before="60" w:after="60"/>
               <w:jc w:val="center"/>
             </w:pPr>
             <w:r>
@@ -517,18 +454,17 @@
         </w:tc>
         <w:tc>
           <w:tcPr>
-            <w:tcW w:w="0" w:type="auto"/>
-            <w:tcBorders>
-              <w:top w:val="single" w:sz="1" w:space="0" w:color="auto"/>
-              <w:left w:val="single" w:sz="1" w:space="0" w:color="auto"/>
-              <w:bottom w:val="single" w:sz="1" w:space="0" w:color="auto"/>
-              <w:right w:val="single" w:sz="1" w:space="0" w:color="auto"/>
-            </w:tcBorders>
+            <w:tcW w:w="2400" w:type="dxa"/>
+            <w:tcMar>
+              <w:top w:w="100" w:type="dxa"/>
+              <w:left w:w="100" w:type="dxa"/>
+              <w:bottom w:w="100" w:type="dxa"/>
+              <w:right w:w="100" w:type="dxa"/>
+            </w:tcMar>
             <w:vAlign w:val="center"/>
           </w:tcPr>
           <w:p>
             <w:pPr>
-              <w:spacing w:before="60" w:after="60"/>
               <w:jc w:val="center"/>
             </w:pPr>
             <w:r>
@@ -542,18 +478,17 @@
         </w:tc>
         <w:tc>
           <w:tcPr>
-            <w:tcW w:w="0" w:type="auto"/>
-            <w:tcBorders>
-              <w:top w:val="single" w:sz="1" w:space="0" w:color="auto"/>
-              <w:left w:val="single" w:sz="1" w:space="0" w:color="auto"/>
-              <w:bottom w:val="single" w:sz="1" w:space="0" w:color="auto"/>
-              <w:right w:val="single" w:sz="1" w:space="0" w:color="auto"/>
-            </w:tcBorders>
+            <w:tcW w:w="600" w:type="dxa"/>
+            <w:tcMar>
+              <w:top w:w="100" w:type="dxa"/>
+              <w:left w:w="100" w:type="dxa"/>
+              <w:bottom w:w="100" w:type="dxa"/>
+              <w:right w:w="100" w:type="dxa"/>
+            </w:tcMar>
             <w:vAlign w:val="center"/>
           </w:tcPr>
           <w:p>
             <w:pPr>
-              <w:spacing w:before="60" w:after="60"/>
               <w:jc w:val="center"/>
             </w:pPr>
             <w:r>
@@ -567,18 +502,17 @@
         </w:tc>
         <w:tc>
           <w:tcPr>
-            <w:tcW w:w="0" w:type="auto"/>
-            <w:tcBorders>
-              <w:top w:val="single" w:sz="1" w:space="0" w:color="auto"/>
-              <w:left w:val="single" w:sz="1" w:space="0" w:color="auto"/>
-              <w:bottom w:val="single" w:sz="1" w:space="0" w:color="auto"/>
-              <w:right w:val="single" w:sz="1" w:space="0" w:color="auto"/>
-            </w:tcBorders>
+            <w:tcW w:w="1000" w:type="dxa"/>
+            <w:tcMar>
+              <w:top w:w="100" w:type="dxa"/>
+              <w:left w:w="100" w:type="dxa"/>
+              <w:bottom w:w="100" w:type="dxa"/>
+              <w:right w:w="100" w:type="dxa"/>
+            </w:tcMar>
             <w:vAlign w:val="center"/>
           </w:tcPr>
           <w:p>
             <w:pPr>
-              <w:spacing w:before="60" w:after="60"/>
               <w:jc w:val="center"/>
             </w:pPr>
             <w:r>
@@ -592,18 +526,17 @@
         </w:tc>
         <w:tc>
           <w:tcPr>
-            <w:tcW w:w="0" w:type="auto"/>
-            <w:tcBorders>
-              <w:top w:val="single" w:sz="1" w:space="0" w:color="auto"/>
-              <w:left w:val="single" w:sz="1" w:space="0" w:color="auto"/>
-              <w:bottom w:val="single" w:sz="1" w:space="0" w:color="auto"/>
-              <w:right w:val="single" w:sz="1" w:space="0" w:color="auto"/>
-            </w:tcBorders>
+            <w:tcW w:w="1200" w:type="dxa"/>
+            <w:tcMar>
+              <w:top w:w="100" w:type="dxa"/>
+              <w:left w:w="100" w:type="dxa"/>
+              <w:bottom w:w="100" w:type="dxa"/>
+              <w:right w:w="100" w:type="dxa"/>
+            </w:tcMar>
             <w:vAlign w:val="center"/>
           </w:tcPr>
           <w:p>
             <w:pPr>
-              <w:spacing w:before="60" w:after="60"/>
               <w:jc w:val="center"/>
             </w:pPr>
             <w:r>
@@ -617,18 +550,17 @@
         </w:tc>
         <w:tc>
           <w:tcPr>
-            <w:tcW w:w="0" w:type="auto"/>
-            <w:tcBorders>
-              <w:top w:val="single" w:sz="1" w:space="0" w:color="auto"/>
-              <w:left w:val="single" w:sz="1" w:space="0" w:color="auto"/>
-              <w:bottom w:val="single" w:sz="1" w:space="0" w:color="auto"/>
-              <w:right w:val="single" w:sz="1" w:space="0" w:color="auto"/>
-            </w:tcBorders>
+            <w:tcW w:w="1000" w:type="dxa"/>
+            <w:tcMar>
+              <w:top w:w="100" w:type="dxa"/>
+              <w:left w:w="100" w:type="dxa"/>
+              <w:bottom w:w="100" w:type="dxa"/>
+              <w:right w:w="100" w:type="dxa"/>
+            </w:tcMar>
             <w:vAlign w:val="center"/>
           </w:tcPr>
           <w:p>
             <w:pPr>
-              <w:spacing w:before="60" w:after="60"/>
               <w:jc w:val="center"/>
             </w:pPr>
             <w:r>
@@ -651,17 +583,16 @@
         <w:tc>
           <w:tcPr>
             <w:tcW w:w="0" w:type="auto"/>
-            <w:tcBorders>
-              <w:top w:val="single" w:sz="1" w:space="0" w:color="auto"/>
-              <w:left w:val="single" w:sz="1" w:space="0" w:color="auto"/>
-              <w:bottom w:val="single" w:sz="1" w:space="0" w:color="auto"/>
-              <w:right w:val="single" w:sz="1" w:space="0" w:color="auto"/>
-            </w:tcBorders>
+            <w:tcMar>
+              <w:top w:w="100" w:type="dxa"/>
+              <w:left w:w="100" w:type="dxa"/>
+              <w:bottom w:w="100" w:type="dxa"/>
+              <w:right w:w="100" w:type="dxa"/>
+            </w:tcMar>
             <w:vAlign w:val="center"/>
           </w:tcPr>
           <w:p>
             <w:pPr>
-              <w:spacing w:before="60" w:after="60"/>
               <w:jc w:val="center"/>
             </w:pPr>
             <w:r>
@@ -672,80 +603,73 @@
         <w:tc>
           <w:tcPr>
             <w:tcW w:w="0" w:type="auto"/>
-            <w:tcBorders>
-              <w:top w:val="single" w:sz="1" w:space="0" w:color="auto"/>
-              <w:left w:val="single" w:sz="1" w:space="0" w:color="auto"/>
-              <w:bottom w:val="single" w:sz="1" w:space="0" w:color="auto"/>
-              <w:right w:val="single" w:sz="1" w:space="0" w:color="auto"/>
-            </w:tcBorders>
+            <w:tcMar>
+              <w:top w:w="100" w:type="dxa"/>
+              <w:left w:w="100" w:type="dxa"/>
+              <w:bottom w:w="100" w:type="dxa"/>
+              <w:right w:w="100" w:type="dxa"/>
+            </w:tcMar>
             <w:vAlign w:val="center"/>
           </w:tcPr>
           <w:p>
             <w:pPr>
-              <w:spacing w:before="60" w:after="60"/>
-            </w:pPr>
-            <w:r>
-              <w:t>AL-001</w:t>
-            </w:r>
-          </w:p>
-        </w:tc>
-        <w:tc>
-          <w:tcPr>
-            <w:tcW w:w="0" w:type="auto"/>
-            <w:tcBorders>
-              <w:top w:val="single" w:sz="1" w:space="0" w:color="auto"/>
-              <w:left w:val="single" w:sz="1" w:space="0" w:color="auto"/>
-              <w:bottom w:val="single" w:sz="1" w:space="0" w:color="auto"/>
-              <w:right w:val="single" w:sz="1" w:space="0" w:color="auto"/>
-            </w:tcBorders>
-            <w:vAlign w:val="center"/>
-          </w:tcPr>
-          <w:p>
-            <w:pPr>
-              <w:spacing w:before="60" w:after="60"/>
-            </w:pPr>
-            <w:r>
-              <w:t>Aluminum Angle - L Profile</w:t>
-            </w:r>
-          </w:p>
-        </w:tc>
-        <w:tc>
-          <w:tcPr>
-            <w:tcW w:w="0" w:type="auto"/>
-            <w:tcBorders>
-              <w:top w:val="single" w:sz="1" w:space="0" w:color="auto"/>
-              <w:left w:val="single" w:sz="1" w:space="0" w:color="auto"/>
-              <w:bottom w:val="single" w:sz="1" w:space="0" w:color="auto"/>
-              <w:right w:val="single" w:sz="1" w:space="0" w:color="auto"/>
-            </w:tcBorders>
-            <w:vAlign w:val="center"/>
-          </w:tcPr>
-          <w:p>
-            <w:pPr>
-              <w:spacing w:before="60" w:after="60"/>
-            </w:pPr>
-            <w:r>
-              <w:t>50 x 50 x 5 mm x 6000 mm</w:t>
-            </w:r>
-          </w:p>
-        </w:tc>
-        <w:tc>
-          <w:tcPr>
-            <w:tcW w:w="0" w:type="auto"/>
-            <w:tcBorders>
-              <w:top w:val="single" w:sz="1" w:space="0" w:color="auto"/>
-              <w:left w:val="single" w:sz="1" w:space="0" w:color="auto"/>
-              <w:bottom w:val="single" w:sz="1" w:space="0" w:color="auto"/>
-              <w:right w:val="single" w:sz="1" w:space="0" w:color="auto"/>
-            </w:tcBorders>
-            <w:vAlign w:val="center"/>
-          </w:tcPr>
-          <w:p>
-            <w:pPr>
-              <w:spacing w:before="60" w:after="60"/>
               <w:jc w:val="center"/>
             </w:pPr>
             <w:r>
+              <w:t>AL-001</w:t>
+            </w:r>
+          </w:p>
+        </w:tc>
+        <w:tc>
+          <w:tcPr>
+            <w:tcW w:w="0" w:type="auto"/>
+            <w:tcMar>
+              <w:top w:w="100" w:type="dxa"/>
+              <w:left w:w="100" w:type="dxa"/>
+              <w:bottom w:w="100" w:type="dxa"/>
+              <w:right w:w="100" w:type="dxa"/>
+            </w:tcMar>
+            <w:vAlign w:val="center"/>
+          </w:tcPr>
+          <w:p>
+            <w:r>
+              <w:t>Aluminum Angle - L Profile</w:t>
+            </w:r>
+          </w:p>
+        </w:tc>
+        <w:tc>
+          <w:tcPr>
+            <w:tcW w:w="0" w:type="auto"/>
+            <w:tcMar>
+              <w:top w:w="100" w:type="dxa"/>
+              <w:left w:w="100" w:type="dxa"/>
+              <w:bottom w:w="100" w:type="dxa"/>
+              <w:right w:w="100" w:type="dxa"/>
+            </w:tcMar>
+            <w:vAlign w:val="center"/>
+          </w:tcPr>
+          <w:p>
+            <w:r>
+              <w:t>50 x 50 x 5 mm x 6000 mm</w:t>
+            </w:r>
+          </w:p>
+        </w:tc>
+        <w:tc>
+          <w:tcPr>
+            <w:tcW w:w="0" w:type="auto"/>
+            <w:tcMar>
+              <w:top w:w="100" w:type="dxa"/>
+              <w:left w:w="100" w:type="dxa"/>
+              <w:bottom w:w="100" w:type="dxa"/>
+              <w:right w:w="100" w:type="dxa"/>
+            </w:tcMar>
+            <w:vAlign w:val="center"/>
+          </w:tcPr>
+          <w:p>
+            <w:pPr>
+              <w:jc w:val="center"/>
+            </w:pPr>
+            <w:r>
               <w:t>200</w:t>
             </w:r>
           </w:p>
@@ -753,17 +677,16 @@
         <w:tc>
           <w:tcPr>
             <w:tcW w:w="0" w:type="auto"/>
-            <w:tcBorders>
-              <w:top w:val="single" w:sz="1" w:space="0" w:color="auto"/>
-              <w:left w:val="single" w:sz="1" w:space="0" w:color="auto"/>
-              <w:bottom w:val="single" w:sz="1" w:space="0" w:color="auto"/>
-              <w:right w:val="single" w:sz="1" w:space="0" w:color="auto"/>
-            </w:tcBorders>
+            <w:tcMar>
+              <w:top w:w="100" w:type="dxa"/>
+              <w:left w:w="100" w:type="dxa"/>
+              <w:bottom w:w="100" w:type="dxa"/>
+              <w:right w:w="100" w:type="dxa"/>
+            </w:tcMar>
             <w:vAlign w:val="center"/>
           </w:tcPr>
           <w:p>
             <w:pPr>
-              <w:spacing w:before="60" w:after="60"/>
               <w:jc w:val="right"/>
             </w:pPr>
             <w:r>
@@ -774,38 +697,37 @@
         <w:tc>
           <w:tcPr>
             <w:tcW w:w="0" w:type="auto"/>
-            <w:tcBorders>
-              <w:top w:val="single" w:sz="1" w:space="0" w:color="auto"/>
-              <w:left w:val="single" w:sz="1" w:space="0" w:color="auto"/>
-              <w:bottom w:val="single" w:sz="1" w:space="0" w:color="auto"/>
-              <w:right w:val="single" w:sz="1" w:space="0" w:color="auto"/>
-            </w:tcBorders>
+            <w:tcMar>
+              <w:top w:w="100" w:type="dxa"/>
+              <w:left w:w="100" w:type="dxa"/>
+              <w:bottom w:w="100" w:type="dxa"/>
+              <w:right w:w="100" w:type="dxa"/>
+            </w:tcMar>
             <w:vAlign w:val="center"/>
           </w:tcPr>
           <w:p>
             <w:pPr>
-              <w:spacing w:before="60" w:after="60"/>
               <w:jc w:val="right"/>
             </w:pPr>
             <w:r>
-              <w:t>$5700.00</w:t>
-            </w:r>
-          </w:p>
-        </w:tc>
-        <w:tc>
-          <w:tcPr>
-            <w:tcW w:w="0" w:type="auto"/>
-            <w:tcBorders>
-              <w:top w:val="single" w:sz="1" w:space="0" w:color="auto"/>
-              <w:left w:val="single" w:sz="1" w:space="0" w:color="auto"/>
-              <w:bottom w:val="single" w:sz="1" w:space="0" w:color="auto"/>
-              <w:right w:val="single" w:sz="1" w:space="0" w:color="auto"/>
-            </w:tcBorders>
+              <w:t>$5,700.00</w:t>
+            </w:r>
+          </w:p>
+        </w:tc>
+        <w:tc>
+          <w:tcPr>
+            <w:tcW w:w="0" w:type="auto"/>
+            <w:tcMar>
+              <w:top w:w="100" w:type="dxa"/>
+              <w:left w:w="100" w:type="dxa"/>
+              <w:bottom w:w="100" w:type="dxa"/>
+              <w:right w:w="100" w:type="dxa"/>
+            </w:tcMar>
             <w:vAlign w:val="center"/>
           </w:tcPr>
           <w:p>
             <w:pPr>
-              <w:spacing w:before="60" w:after="60"/>
+              <w:jc w:val="center"/>
             </w:pPr>
             <w:r>
               <w:t>December 01, 2025</w:t>
@@ -823,17 +745,16 @@
         <w:tc>
           <w:tcPr>
             <w:tcW w:w="0" w:type="auto"/>
-            <w:tcBorders>
-              <w:top w:val="single" w:sz="1" w:space="0" w:color="auto"/>
-              <w:left w:val="single" w:sz="1" w:space="0" w:color="auto"/>
-              <w:bottom w:val="single" w:sz="1" w:space="0" w:color="auto"/>
-              <w:right w:val="single" w:sz="1" w:space="0" w:color="auto"/>
-            </w:tcBorders>
+            <w:tcMar>
+              <w:top w:w="100" w:type="dxa"/>
+              <w:left w:w="100" w:type="dxa"/>
+              <w:bottom w:w="100" w:type="dxa"/>
+              <w:right w:w="100" w:type="dxa"/>
+            </w:tcMar>
             <w:vAlign w:val="center"/>
           </w:tcPr>
           <w:p>
             <w:pPr>
-              <w:spacing w:before="60" w:after="60"/>
               <w:jc w:val="center"/>
             </w:pPr>
             <w:r>
@@ -844,80 +765,73 @@
         <w:tc>
           <w:tcPr>
             <w:tcW w:w="0" w:type="auto"/>
-            <w:tcBorders>
-              <w:top w:val="single" w:sz="1" w:space="0" w:color="auto"/>
-              <w:left w:val="single" w:sz="1" w:space="0" w:color="auto"/>
-              <w:bottom w:val="single" w:sz="1" w:space="0" w:color="auto"/>
-              <w:right w:val="single" w:sz="1" w:space="0" w:color="auto"/>
-            </w:tcBorders>
+            <w:tcMar>
+              <w:top w:w="100" w:type="dxa"/>
+              <w:left w:w="100" w:type="dxa"/>
+              <w:bottom w:w="100" w:type="dxa"/>
+              <w:right w:w="100" w:type="dxa"/>
+            </w:tcMar>
             <w:vAlign w:val="center"/>
           </w:tcPr>
           <w:p>
             <w:pPr>
-              <w:spacing w:before="60" w:after="60"/>
-            </w:pPr>
-            <w:r>
-              <w:t>SS-001</w:t>
-            </w:r>
-          </w:p>
-        </w:tc>
-        <w:tc>
-          <w:tcPr>
-            <w:tcW w:w="0" w:type="auto"/>
-            <w:tcBorders>
-              <w:top w:val="single" w:sz="1" w:space="0" w:color="auto"/>
-              <w:left w:val="single" w:sz="1" w:space="0" w:color="auto"/>
-              <w:bottom w:val="single" w:sz="1" w:space="0" w:color="auto"/>
-              <w:right w:val="single" w:sz="1" w:space="0" w:color="auto"/>
-            </w:tcBorders>
-            <w:vAlign w:val="center"/>
-          </w:tcPr>
-          <w:p>
-            <w:pPr>
-              <w:spacing w:before="60" w:after="60"/>
-            </w:pPr>
-            <w:r>
-              <w:t>Stainless Steel Sheet - Grade 304</w:t>
-            </w:r>
-          </w:p>
-        </w:tc>
-        <w:tc>
-          <w:tcPr>
-            <w:tcW w:w="0" w:type="auto"/>
-            <w:tcBorders>
-              <w:top w:val="single" w:sz="1" w:space="0" w:color="auto"/>
-              <w:left w:val="single" w:sz="1" w:space="0" w:color="auto"/>
-              <w:bottom w:val="single" w:sz="1" w:space="0" w:color="auto"/>
-              <w:right w:val="single" w:sz="1" w:space="0" w:color="auto"/>
-            </w:tcBorders>
-            <w:vAlign w:val="center"/>
-          </w:tcPr>
-          <w:p>
-            <w:pPr>
-              <w:spacing w:before="60" w:after="60"/>
-            </w:pPr>
-            <w:r>
-              <w:t>1220 x 2440 x 3 mm</w:t>
-            </w:r>
-          </w:p>
-        </w:tc>
-        <w:tc>
-          <w:tcPr>
-            <w:tcW w:w="0" w:type="auto"/>
-            <w:tcBorders>
-              <w:top w:val="single" w:sz="1" w:space="0" w:color="auto"/>
-              <w:left w:val="single" w:sz="1" w:space="0" w:color="auto"/>
-              <w:bottom w:val="single" w:sz="1" w:space="0" w:color="auto"/>
-              <w:right w:val="single" w:sz="1" w:space="0" w:color="auto"/>
-            </w:tcBorders>
-            <w:vAlign w:val="center"/>
-          </w:tcPr>
-          <w:p>
-            <w:pPr>
-              <w:spacing w:before="60" w:after="60"/>
               <w:jc w:val="center"/>
             </w:pPr>
             <w:r>
+              <w:t>SS-001</w:t>
+            </w:r>
+          </w:p>
+        </w:tc>
+        <w:tc>
+          <w:tcPr>
+            <w:tcW w:w="0" w:type="auto"/>
+            <w:tcMar>
+              <w:top w:w="100" w:type="dxa"/>
+              <w:left w:w="100" w:type="dxa"/>
+              <w:bottom w:w="100" w:type="dxa"/>
+              <w:right w:w="100" w:type="dxa"/>
+            </w:tcMar>
+            <w:vAlign w:val="center"/>
+          </w:tcPr>
+          <w:p>
+            <w:r>
+              <w:t>Stainless Steel Sheet - Grade 304</w:t>
+            </w:r>
+          </w:p>
+        </w:tc>
+        <w:tc>
+          <w:tcPr>
+            <w:tcW w:w="0" w:type="auto"/>
+            <w:tcMar>
+              <w:top w:w="100" w:type="dxa"/>
+              <w:left w:w="100" w:type="dxa"/>
+              <w:bottom w:w="100" w:type="dxa"/>
+              <w:right w:w="100" w:type="dxa"/>
+            </w:tcMar>
+            <w:vAlign w:val="center"/>
+          </w:tcPr>
+          <w:p>
+            <w:r>
+              <w:t>1220 x 2440 x 3 mm</w:t>
+            </w:r>
+          </w:p>
+        </w:tc>
+        <w:tc>
+          <w:tcPr>
+            <w:tcW w:w="0" w:type="auto"/>
+            <w:tcMar>
+              <w:top w:w="100" w:type="dxa"/>
+              <w:left w:w="100" w:type="dxa"/>
+              <w:bottom w:w="100" w:type="dxa"/>
+              <w:right w:w="100" w:type="dxa"/>
+            </w:tcMar>
+            <w:vAlign w:val="center"/>
+          </w:tcPr>
+          <w:p>
+            <w:pPr>
+              <w:jc w:val="center"/>
+            </w:pPr>
+            <w:r>
               <w:t>50</w:t>
             </w:r>
           </w:p>
@@ -925,17 +839,16 @@
         <w:tc>
           <w:tcPr>
             <w:tcW w:w="0" w:type="auto"/>
-            <w:tcBorders>
-              <w:top w:val="single" w:sz="1" w:space="0" w:color="auto"/>
-              <w:left w:val="single" w:sz="1" w:space="0" w:color="auto"/>
-              <w:bottom w:val="single" w:sz="1" w:space="0" w:color="auto"/>
-              <w:right w:val="single" w:sz="1" w:space="0" w:color="auto"/>
-            </w:tcBorders>
+            <w:tcMar>
+              <w:top w:w="100" w:type="dxa"/>
+              <w:left w:w="100" w:type="dxa"/>
+              <w:bottom w:w="100" w:type="dxa"/>
+              <w:right w:w="100" w:type="dxa"/>
+            </w:tcMar>
             <w:vAlign w:val="center"/>
           </w:tcPr>
           <w:p>
             <w:pPr>
-              <w:spacing w:before="60" w:after="60"/>
               <w:jc w:val="right"/>
             </w:pPr>
             <w:r>
@@ -946,38 +859,37 @@
         <w:tc>
           <w:tcPr>
             <w:tcW w:w="0" w:type="auto"/>
-            <w:tcBorders>
-              <w:top w:val="single" w:sz="1" w:space="0" w:color="auto"/>
-              <w:left w:val="single" w:sz="1" w:space="0" w:color="auto"/>
-              <w:bottom w:val="single" w:sz="1" w:space="0" w:color="auto"/>
-              <w:right w:val="single" w:sz="1" w:space="0" w:color="auto"/>
-            </w:tcBorders>
+            <w:tcMar>
+              <w:top w:w="100" w:type="dxa"/>
+              <w:left w:w="100" w:type="dxa"/>
+              <w:bottom w:w="100" w:type="dxa"/>
+              <w:right w:w="100" w:type="dxa"/>
+            </w:tcMar>
             <w:vAlign w:val="center"/>
           </w:tcPr>
           <w:p>
             <w:pPr>
-              <w:spacing w:before="60" w:after="60"/>
               <w:jc w:val="right"/>
             </w:pPr>
             <w:r>
-              <w:t>$9787.50</w:t>
-            </w:r>
-          </w:p>
-        </w:tc>
-        <w:tc>
-          <w:tcPr>
-            <w:tcW w:w="0" w:type="auto"/>
-            <w:tcBorders>
-              <w:top w:val="single" w:sz="1" w:space="0" w:color="auto"/>
-              <w:left w:val="single" w:sz="1" w:space="0" w:color="auto"/>
-              <w:bottom w:val="single" w:sz="1" w:space="0" w:color="auto"/>
-              <w:right w:val="single" w:sz="1" w:space="0" w:color="auto"/>
-            </w:tcBorders>
+              <w:t>$9,787.50</w:t>
+            </w:r>
+          </w:p>
+        </w:tc>
+        <w:tc>
+          <w:tcPr>
+            <w:tcW w:w="0" w:type="auto"/>
+            <w:tcMar>
+              <w:top w:w="100" w:type="dxa"/>
+              <w:left w:w="100" w:type="dxa"/>
+              <w:bottom w:w="100" w:type="dxa"/>
+              <w:right w:w="100" w:type="dxa"/>
+            </w:tcMar>
             <w:vAlign w:val="center"/>
           </w:tcPr>
           <w:p>
             <w:pPr>
-              <w:spacing w:before="60" w:after="60"/>
+              <w:jc w:val="center"/>
             </w:pPr>
             <w:r>
               <w:t>December 05, 2025</w:t>
@@ -995,17 +907,16 @@
         <w:tc>
           <w:tcPr>
             <w:tcW w:w="0" w:type="auto"/>
-            <w:tcBorders>
-              <w:top w:val="single" w:sz="1" w:space="0" w:color="auto"/>
-              <w:left w:val="single" w:sz="1" w:space="0" w:color="auto"/>
-              <w:bottom w:val="single" w:sz="1" w:space="0" w:color="auto"/>
-              <w:right w:val="single" w:sz="1" w:space="0" w:color="auto"/>
-            </w:tcBorders>
+            <w:tcMar>
+              <w:top w:w="100" w:type="dxa"/>
+              <w:left w:w="100" w:type="dxa"/>
+              <w:bottom w:w="100" w:type="dxa"/>
+              <w:right w:w="100" w:type="dxa"/>
+            </w:tcMar>
             <w:vAlign w:val="center"/>
           </w:tcPr>
           <w:p>
             <w:pPr>
-              <w:spacing w:before="60" w:after="60"/>
               <w:jc w:val="center"/>
             </w:pPr>
             <w:r>
@@ -1016,80 +927,73 @@
         <w:tc>
           <w:tcPr>
             <w:tcW w:w="0" w:type="auto"/>
-            <w:tcBorders>
-              <w:top w:val="single" w:sz="1" w:space="0" w:color="auto"/>
-              <w:left w:val="single" w:sz="1" w:space="0" w:color="auto"/>
-              <w:bottom w:val="single" w:sz="1" w:space="0" w:color="auto"/>
-              <w:right w:val="single" w:sz="1" w:space="0" w:color="auto"/>
-            </w:tcBorders>
+            <w:tcMar>
+              <w:top w:w="100" w:type="dxa"/>
+              <w:left w:w="100" w:type="dxa"/>
+              <w:bottom w:w="100" w:type="dxa"/>
+              <w:right w:w="100" w:type="dxa"/>
+            </w:tcMar>
             <w:vAlign w:val="center"/>
           </w:tcPr>
           <w:p>
             <w:pPr>
-              <w:spacing w:before="60" w:after="60"/>
-            </w:pPr>
-            <w:r>
-              <w:t>CS-001</w:t>
-            </w:r>
-          </w:p>
-        </w:tc>
-        <w:tc>
-          <w:tcPr>
-            <w:tcW w:w="0" w:type="auto"/>
-            <w:tcBorders>
-              <w:top w:val="single" w:sz="1" w:space="0" w:color="auto"/>
-              <w:left w:val="single" w:sz="1" w:space="0" w:color="auto"/>
-              <w:bottom w:val="single" w:sz="1" w:space="0" w:color="auto"/>
-              <w:right w:val="single" w:sz="1" w:space="0" w:color="auto"/>
-            </w:tcBorders>
-            <w:vAlign w:val="center"/>
-          </w:tcPr>
-          <w:p>
-            <w:pPr>
-              <w:spacing w:before="60" w:after="60"/>
-            </w:pPr>
-            <w:r>
-              <w:t>Seamless Carbon Steel Pipe</w:t>
-            </w:r>
-          </w:p>
-        </w:tc>
-        <w:tc>
-          <w:tcPr>
-            <w:tcW w:w="0" w:type="auto"/>
-            <w:tcBorders>
-              <w:top w:val="single" w:sz="1" w:space="0" w:color="auto"/>
-              <w:left w:val="single" w:sz="1" w:space="0" w:color="auto"/>
-              <w:bottom w:val="single" w:sz="1" w:space="0" w:color="auto"/>
-              <w:right w:val="single" w:sz="1" w:space="0" w:color="auto"/>
-            </w:tcBorders>
-            <w:vAlign w:val="center"/>
-          </w:tcPr>
-          <w:p>
-            <w:pPr>
-              <w:spacing w:before="60" w:after="60"/>
-            </w:pPr>
-            <w:r>
-              <w:t>NPS 2" (60.3 mm OD) x SCH 40 x 6000 mm</w:t>
-            </w:r>
-          </w:p>
-        </w:tc>
-        <w:tc>
-          <w:tcPr>
-            <w:tcW w:w="0" w:type="auto"/>
-            <w:tcBorders>
-              <w:top w:val="single" w:sz="1" w:space="0" w:color="auto"/>
-              <w:left w:val="single" w:sz="1" w:space="0" w:color="auto"/>
-              <w:bottom w:val="single" w:sz="1" w:space="0" w:color="auto"/>
-              <w:right w:val="single" w:sz="1" w:space="0" w:color="auto"/>
-            </w:tcBorders>
-            <w:vAlign w:val="center"/>
-          </w:tcPr>
-          <w:p>
-            <w:pPr>
-              <w:spacing w:before="60" w:after="60"/>
               <w:jc w:val="center"/>
             </w:pPr>
             <w:r>
+              <w:t>CS-001</w:t>
+            </w:r>
+          </w:p>
+        </w:tc>
+        <w:tc>
+          <w:tcPr>
+            <w:tcW w:w="0" w:type="auto"/>
+            <w:tcMar>
+              <w:top w:w="100" w:type="dxa"/>
+              <w:left w:w="100" w:type="dxa"/>
+              <w:bottom w:w="100" w:type="dxa"/>
+              <w:right w:w="100" w:type="dxa"/>
+            </w:tcMar>
+            <w:vAlign w:val="center"/>
+          </w:tcPr>
+          <w:p>
+            <w:r>
+              <w:t>Seamless Carbon Steel Pipe</w:t>
+            </w:r>
+          </w:p>
+        </w:tc>
+        <w:tc>
+          <w:tcPr>
+            <w:tcW w:w="0" w:type="auto"/>
+            <w:tcMar>
+              <w:top w:w="100" w:type="dxa"/>
+              <w:left w:w="100" w:type="dxa"/>
+              <w:bottom w:w="100" w:type="dxa"/>
+              <w:right w:w="100" w:type="dxa"/>
+            </w:tcMar>
+            <w:vAlign w:val="center"/>
+          </w:tcPr>
+          <w:p>
+            <w:r>
+              <w:t>NPS 2" (60.3 mm OD) x SCH 40 x 6000 mm</w:t>
+            </w:r>
+          </w:p>
+        </w:tc>
+        <w:tc>
+          <w:tcPr>
+            <w:tcW w:w="0" w:type="auto"/>
+            <w:tcMar>
+              <w:top w:w="100" w:type="dxa"/>
+              <w:left w:w="100" w:type="dxa"/>
+              <w:bottom w:w="100" w:type="dxa"/>
+              <w:right w:w="100" w:type="dxa"/>
+            </w:tcMar>
+            <w:vAlign w:val="center"/>
+          </w:tcPr>
+          <w:p>
+            <w:pPr>
+              <w:jc w:val="center"/>
+            </w:pPr>
+            <w:r>
               <w:t>150</w:t>
             </w:r>
           </w:p>
@@ -1097,17 +1001,16 @@
         <w:tc>
           <w:tcPr>
             <w:tcW w:w="0" w:type="auto"/>
-            <w:tcBorders>
-              <w:top w:val="single" w:sz="1" w:space="0" w:color="auto"/>
-              <w:left w:val="single" w:sz="1" w:space="0" w:color="auto"/>
-              <w:bottom w:val="single" w:sz="1" w:space="0" w:color="auto"/>
-              <w:right w:val="single" w:sz="1" w:space="0" w:color="auto"/>
-            </w:tcBorders>
+            <w:tcMar>
+              <w:top w:w="100" w:type="dxa"/>
+              <w:left w:w="100" w:type="dxa"/>
+              <w:bottom w:w="100" w:type="dxa"/>
+              <w:right w:w="100" w:type="dxa"/>
+            </w:tcMar>
             <w:vAlign w:val="center"/>
           </w:tcPr>
           <w:p>
             <w:pPr>
-              <w:spacing w:before="60" w:after="60"/>
               <w:jc w:val="right"/>
             </w:pPr>
             <w:r>
@@ -1118,38 +1021,37 @@
         <w:tc>
           <w:tcPr>
             <w:tcW w:w="0" w:type="auto"/>
-            <w:tcBorders>
-              <w:top w:val="single" w:sz="1" w:space="0" w:color="auto"/>
-              <w:left w:val="single" w:sz="1" w:space="0" w:color="auto"/>
-              <w:bottom w:val="single" w:sz="1" w:space="0" w:color="auto"/>
-              <w:right w:val="single" w:sz="1" w:space="0" w:color="auto"/>
-            </w:tcBorders>
+            <w:tcMar>
+              <w:top w:w="100" w:type="dxa"/>
+              <w:left w:w="100" w:type="dxa"/>
+              <w:bottom w:w="100" w:type="dxa"/>
+              <w:right w:w="100" w:type="dxa"/>
+            </w:tcMar>
             <w:vAlign w:val="center"/>
           </w:tcPr>
           <w:p>
             <w:pPr>
-              <w:spacing w:before="60" w:after="60"/>
               <w:jc w:val="right"/>
             </w:pPr>
             <w:r>
-              <w:t>$10080.00</w:t>
-            </w:r>
-          </w:p>
-        </w:tc>
-        <w:tc>
-          <w:tcPr>
-            <w:tcW w:w="0" w:type="auto"/>
-            <w:tcBorders>
-              <w:top w:val="single" w:sz="1" w:space="0" w:color="auto"/>
-              <w:left w:val="single" w:sz="1" w:space="0" w:color="auto"/>
-              <w:bottom w:val="single" w:sz="1" w:space="0" w:color="auto"/>
-              <w:right w:val="single" w:sz="1" w:space="0" w:color="auto"/>
-            </w:tcBorders>
+              <w:t>$10,080.00</w:t>
+            </w:r>
+          </w:p>
+        </w:tc>
+        <w:tc>
+          <w:tcPr>
+            <w:tcW w:w="0" w:type="auto"/>
+            <w:tcMar>
+              <w:top w:w="100" w:type="dxa"/>
+              <w:left w:w="100" w:type="dxa"/>
+              <w:bottom w:w="100" w:type="dxa"/>
+              <w:right w:w="100" w:type="dxa"/>
+            </w:tcMar>
             <w:vAlign w:val="center"/>
           </w:tcPr>
           <w:p>
             <w:pPr>
-              <w:spacing w:before="60" w:after="60"/>
+              <w:jc w:val="center"/>
             </w:pPr>
             <w:r>
               <w:t>December 10, 2025</w:t>
@@ -1160,17 +1062,32 @@
     </w:tbl>
     <w:p>
       <w:pPr>
-        <w:spacing w:before="180"/>
+        <w:spacing w:before="120" w:after="120"/>
+        <w:rPr>
+          <w:b/>
+          <w:bCs/>
+          <w:sz w:val="24"/>
+          <w:szCs w:val="24"/>
+        </w:rPr>
       </w:pPr>
+      <w:r>
+        <w:rPr>
+          <w:b/>
+          <w:bCs/>
+          <w:sz w:val="24"/>
+          <w:szCs w:val="24"/>
+        </w:rPr>
+        <w:t>PRICING SUMMARY</w:t>
+      </w:r>
     </w:p>
     <w:tbl>
       <w:tblPr>
-        <w:tblW w:w="1817" w:type="pct"/>
+        <w:tblW w:w="2290" w:type="pct"/>
         <w:tblBorders>
-          <w:top w:val="single" w:sz="1" w:space="0" w:color="auto"/>
-          <w:left w:val="single" w:sz="1" w:space="0" w:color="auto"/>
-          <w:bottom w:val="single" w:sz="1" w:space="0" w:color="auto"/>
-          <w:right w:val="single" w:sz="1" w:space="0" w:color="auto"/>
+          <w:top w:val="single" w:sz="4" w:space="0" w:color="auto"/>
+          <w:left w:val="single" w:sz="4" w:space="0" w:color="auto"/>
+          <w:bottom w:val="single" w:sz="4" w:space="0" w:color="auto"/>
+          <w:right w:val="single" w:sz="4" w:space="0" w:color="auto"/>
           <w:insideH w:val="single" w:sz="4" w:space="0" w:color="auto"/>
           <w:insideV w:val="single" w:sz="4" w:space="0" w:color="auto"/>
         </w:tblBorders>
@@ -1178,11 +1095,11 @@
           <w:left w:w="10" w:type="dxa"/>
           <w:right w:w="10" w:type="dxa"/>
         </w:tblCellMar>
-        <w:tblLook w:val="04A0" w:firstRow="1" w:lastRow="0" w:firstColumn="1" w:lastColumn="0" w:noHBand="0" w:noVBand="1"/>
+        <w:tblLook w:val="0000" w:firstRow="0" w:lastRow="0" w:firstColumn="0" w:lastColumn="0" w:noHBand="0" w:noVBand="0"/>
       </w:tblPr>
       <w:tblGrid>
-        <w:gridCol w:w="2126"/>
-        <w:gridCol w:w="1275"/>
+        <w:gridCol w:w="2063"/>
+        <w:gridCol w:w="2219"/>
       </w:tblGrid>
       <w:tr>
         <w:tblPrEx>
@@ -1193,46 +1110,35 @@
         </w:tblPrEx>
         <w:tc>
           <w:tcPr>
-            <w:tcW w:w="3126" w:type="pct"/>
-            <w:tcBorders>
-              <w:top w:val="single" w:sz="1" w:space="0" w:color="auto"/>
-              <w:left w:val="single" w:sz="1" w:space="0" w:color="auto"/>
-              <w:bottom w:val="single" w:sz="1" w:space="0" w:color="auto"/>
-              <w:right w:val="single" w:sz="1" w:space="0" w:color="auto"/>
-            </w:tcBorders>
-            <w:vAlign w:val="center"/>
-          </w:tcPr>
-          <w:p>
-            <w:pPr>
-              <w:spacing w:before="60" w:after="60"/>
-            </w:pPr>
-            <w:r>
-              <w:rPr>
-                <w:b/>
-                <w:bCs/>
-              </w:rPr>
-              <w:t>Subtotal:</w:t>
-            </w:r>
-          </w:p>
-        </w:tc>
-        <w:tc>
-          <w:tcPr>
-            <w:tcW w:w="1874" w:type="pct"/>
-            <w:tcBorders>
-              <w:top w:val="single" w:sz="1" w:space="0" w:color="auto"/>
-              <w:left w:val="single" w:sz="1" w:space="0" w:color="auto"/>
-              <w:bottom w:val="single" w:sz="1" w:space="0" w:color="auto"/>
-              <w:right w:val="single" w:sz="1" w:space="0" w:color="auto"/>
-            </w:tcBorders>
-            <w:vAlign w:val="center"/>
-          </w:tcPr>
-          <w:p>
-            <w:pPr>
-              <w:spacing w:before="60" w:after="60"/>
-              <w:jc w:val="right"/>
-            </w:pPr>
-            <w:r>
-              <w:t>$25567.50</w:t>
+            <w:tcW w:w="2409" w:type="pct"/>
+            <w:tcMar>
+              <w:top w:w="100" w:type="dxa"/>
+              <w:left w:w="100" w:type="dxa"/>
+              <w:bottom w:w="100" w:type="dxa"/>
+              <w:right w:w="100" w:type="dxa"/>
+            </w:tcMar>
+            <w:vAlign w:val="center"/>
+          </w:tcPr>
+          <w:p>
+            <w:r>
+              <w:t>Material Subtotal:</w:t>
+            </w:r>
+          </w:p>
+        </w:tc>
+        <w:tc>
+          <w:tcPr>
+            <w:tcW w:w="0" w:type="auto"/>
+            <w:tcMar>
+              <w:top w:w="100" w:type="dxa"/>
+              <w:left w:w="100" w:type="dxa"/>
+              <w:bottom w:w="100" w:type="dxa"/>
+              <w:right w:w="100" w:type="dxa"/>
+            </w:tcMar>
+            <w:vAlign w:val="center"/>
+          </w:tcPr>
+          <w:p>
+            <w:r>
+              <w:t>$25,567.50</w:t>
             </w:r>
           </w:p>
         </w:tc>
@@ -1246,46 +1152,35 @@
         </w:tblPrEx>
         <w:tc>
           <w:tcPr>
-            <w:tcW w:w="3126" w:type="pct"/>
-            <w:tcBorders>
-              <w:top w:val="single" w:sz="1" w:space="0" w:color="auto"/>
-              <w:left w:val="single" w:sz="1" w:space="0" w:color="auto"/>
-              <w:bottom w:val="single" w:sz="1" w:space="0" w:color="auto"/>
-              <w:right w:val="single" w:sz="1" w:space="0" w:color="auto"/>
-            </w:tcBorders>
-            <w:vAlign w:val="center"/>
-          </w:tcPr>
-          <w:p>
-            <w:pPr>
-              <w:spacing w:before="60" w:after="60"/>
-            </w:pPr>
-            <w:r>
-              <w:rPr>
-                <w:b/>
-                <w:bCs/>
-              </w:rPr>
+            <w:tcW w:w="2409" w:type="pct"/>
+            <w:tcMar>
+              <w:top w:w="100" w:type="dxa"/>
+              <w:left w:w="100" w:type="dxa"/>
+              <w:bottom w:w="100" w:type="dxa"/>
+              <w:right w:w="100" w:type="dxa"/>
+            </w:tcMar>
+            <w:vAlign w:val="center"/>
+          </w:tcPr>
+          <w:p>
+            <w:r>
               <w:t>Volume Discount (5%):</w:t>
             </w:r>
           </w:p>
         </w:tc>
         <w:tc>
           <w:tcPr>
-            <w:tcW w:w="1874" w:type="pct"/>
-            <w:tcBorders>
-              <w:top w:val="single" w:sz="1" w:space="0" w:color="auto"/>
-              <w:left w:val="single" w:sz="1" w:space="0" w:color="auto"/>
-              <w:bottom w:val="single" w:sz="1" w:space="0" w:color="auto"/>
-              <w:right w:val="single" w:sz="1" w:space="0" w:color="auto"/>
-            </w:tcBorders>
-            <w:vAlign w:val="center"/>
-          </w:tcPr>
-          <w:p>
-            <w:pPr>
-              <w:spacing w:before="60" w:after="60"/>
-              <w:jc w:val="right"/>
-            </w:pPr>
-            <w:r>
-              <w:t>-$1278.38</w:t>
+            <w:tcW w:w="0" w:type="auto"/>
+            <w:tcMar>
+              <w:top w:w="100" w:type="dxa"/>
+              <w:left w:w="100" w:type="dxa"/>
+              <w:bottom w:w="100" w:type="dxa"/>
+              <w:right w:w="100" w:type="dxa"/>
+            </w:tcMar>
+            <w:vAlign w:val="center"/>
+          </w:tcPr>
+          <w:p>
+            <w:r>
+              <w:t>-$1,278.38</w:t>
             </w:r>
           </w:p>
         </w:tc>
@@ -1299,46 +1194,35 @@
         </w:tblPrEx>
         <w:tc>
           <w:tcPr>
-            <w:tcW w:w="3126" w:type="pct"/>
-            <w:tcBorders>
-              <w:top w:val="single" w:sz="1" w:space="0" w:color="auto"/>
-              <w:left w:val="single" w:sz="1" w:space="0" w:color="auto"/>
-              <w:bottom w:val="single" w:sz="1" w:space="0" w:color="auto"/>
-              <w:right w:val="single" w:sz="1" w:space="0" w:color="auto"/>
-            </w:tcBorders>
-            <w:vAlign w:val="center"/>
-          </w:tcPr>
-          <w:p>
-            <w:pPr>
-              <w:spacing w:before="60" w:after="60"/>
-            </w:pPr>
-            <w:r>
-              <w:rPr>
-                <w:b/>
-                <w:bCs/>
-              </w:rPr>
-              <w:t>Total Testing/Cert:</w:t>
-            </w:r>
-          </w:p>
-        </w:tc>
-        <w:tc>
-          <w:tcPr>
-            <w:tcW w:w="1874" w:type="pct"/>
-            <w:tcBorders>
-              <w:top w:val="single" w:sz="1" w:space="0" w:color="auto"/>
-              <w:left w:val="single" w:sz="1" w:space="0" w:color="auto"/>
-              <w:bottom w:val="single" w:sz="1" w:space="0" w:color="auto"/>
-              <w:right w:val="single" w:sz="1" w:space="0" w:color="auto"/>
-            </w:tcBorders>
-            <w:vAlign w:val="center"/>
-          </w:tcPr>
-          <w:p>
-            <w:pPr>
-              <w:spacing w:before="60" w:after="60"/>
-              <w:jc w:val="right"/>
-            </w:pPr>
-            <w:r>
-              <w:t>$165.00</w:t>
+            <w:tcW w:w="2409" w:type="pct"/>
+            <w:tcMar>
+              <w:top w:w="100" w:type="dxa"/>
+              <w:left w:w="100" w:type="dxa"/>
+              <w:bottom w:w="100" w:type="dxa"/>
+              <w:right w:w="100" w:type="dxa"/>
+            </w:tcMar>
+            <w:vAlign w:val="center"/>
+          </w:tcPr>
+          <w:p>
+            <w:r>
+              <w:t>Net Material Cost:</w:t>
+            </w:r>
+          </w:p>
+        </w:tc>
+        <w:tc>
+          <w:tcPr>
+            <w:tcW w:w="0" w:type="auto"/>
+            <w:tcMar>
+              <w:top w:w="100" w:type="dxa"/>
+              <w:left w:w="100" w:type="dxa"/>
+              <w:bottom w:w="100" w:type="dxa"/>
+              <w:right w:w="100" w:type="dxa"/>
+            </w:tcMar>
+            <w:vAlign w:val="center"/>
+          </w:tcPr>
+          <w:p>
+            <w:r>
+              <w:t>$24,289.12</w:t>
             </w:r>
           </w:p>
         </w:tc>
@@ -1352,46 +1236,35 @@
         </w:tblPrEx>
         <w:tc>
           <w:tcPr>
-            <w:tcW w:w="3126" w:type="pct"/>
-            <w:tcBorders>
-              <w:top w:val="single" w:sz="1" w:space="0" w:color="auto"/>
-              <w:left w:val="single" w:sz="1" w:space="0" w:color="auto"/>
-              <w:bottom w:val="single" w:sz="1" w:space="0" w:color="auto"/>
-              <w:right w:val="single" w:sz="1" w:space="0" w:color="auto"/>
-            </w:tcBorders>
-            <w:vAlign w:val="center"/>
-          </w:tcPr>
-          <w:p>
-            <w:pPr>
-              <w:spacing w:before="60" w:after="60"/>
-            </w:pPr>
-            <w:r>
-              <w:rPr>
-                <w:b/>
-                <w:bCs/>
-              </w:rPr>
-              <w:t>Total Shipping Cost:</w:t>
-            </w:r>
-          </w:p>
-        </w:tc>
-        <w:tc>
-          <w:tcPr>
-            <w:tcW w:w="1874" w:type="pct"/>
-            <w:tcBorders>
-              <w:top w:val="single" w:sz="1" w:space="0" w:color="auto"/>
-              <w:left w:val="single" w:sz="1" w:space="0" w:color="auto"/>
-              <w:bottom w:val="single" w:sz="1" w:space="0" w:color="auto"/>
-              <w:right w:val="single" w:sz="1" w:space="0" w:color="auto"/>
-            </w:tcBorders>
-            <w:vAlign w:val="center"/>
-          </w:tcPr>
-          <w:p>
-            <w:pPr>
-              <w:spacing w:before="60" w:after="60"/>
-              <w:jc w:val="right"/>
-            </w:pPr>
-            <w:r>
-              <w:t>$450.00</w:t>
+            <w:tcW w:w="2409" w:type="pct"/>
+            <w:tcMar>
+              <w:top w:w="100" w:type="dxa"/>
+              <w:left w:w="100" w:type="dxa"/>
+              <w:bottom w:w="100" w:type="dxa"/>
+              <w:right w:w="100" w:type="dxa"/>
+            </w:tcMar>
+            <w:vAlign w:val="center"/>
+          </w:tcPr>
+          <w:p>
+            <w:r>
+              <w:t>Total Testing/Cert Fees:</w:t>
+            </w:r>
+          </w:p>
+        </w:tc>
+        <w:tc>
+          <w:tcPr>
+            <w:tcW w:w="0" w:type="auto"/>
+            <w:tcMar>
+              <w:top w:w="100" w:type="dxa"/>
+              <w:left w:w="100" w:type="dxa"/>
+              <w:bottom w:w="100" w:type="dxa"/>
+              <w:right w:w="100" w:type="dxa"/>
+            </w:tcMar>
+            <w:vAlign w:val="center"/>
+          </w:tcPr>
+          <w:p>
+            <w:r>
+              <w:t>$165.00</w:t>
             </w:r>
           </w:p>
         </w:tc>
@@ -1405,46 +1278,35 @@
         </w:tblPrEx>
         <w:tc>
           <w:tcPr>
-            <w:tcW w:w="3126" w:type="pct"/>
-            <w:tcBorders>
-              <w:top w:val="single" w:sz="1" w:space="0" w:color="auto"/>
-              <w:left w:val="single" w:sz="1" w:space="0" w:color="auto"/>
-              <w:bottom w:val="single" w:sz="1" w:space="0" w:color="auto"/>
-              <w:right w:val="single" w:sz="1" w:space="0" w:color="auto"/>
-            </w:tcBorders>
-            <w:vAlign w:val="center"/>
-          </w:tcPr>
-          <w:p>
-            <w:pPr>
-              <w:spacing w:before="60" w:after="60"/>
-            </w:pPr>
-            <w:r>
-              <w:rPr>
-                <w:b/>
-                <w:bCs/>
-              </w:rPr>
-              <w:t>Tax (6%):</w:t>
-            </w:r>
-          </w:p>
-        </w:tc>
-        <w:tc>
-          <w:tcPr>
-            <w:tcW w:w="1874" w:type="pct"/>
-            <w:tcBorders>
-              <w:top w:val="single" w:sz="1" w:space="0" w:color="auto"/>
-              <w:left w:val="single" w:sz="1" w:space="0" w:color="auto"/>
-              <w:bottom w:val="single" w:sz="1" w:space="0" w:color="auto"/>
-              <w:right w:val="single" w:sz="1" w:space="0" w:color="auto"/>
-            </w:tcBorders>
-            <w:vAlign w:val="center"/>
-          </w:tcPr>
-          <w:p>
-            <w:pPr>
-              <w:spacing w:before="60" w:after="60"/>
-              <w:jc w:val="right"/>
-            </w:pPr>
-            <w:r>
-              <w:t>$1467.25</w:t>
+            <w:tcW w:w="2409" w:type="pct"/>
+            <w:tcMar>
+              <w:top w:w="100" w:type="dxa"/>
+              <w:left w:w="100" w:type="dxa"/>
+              <w:bottom w:w="100" w:type="dxa"/>
+              <w:right w:w="100" w:type="dxa"/>
+            </w:tcMar>
+            <w:vAlign w:val="center"/>
+          </w:tcPr>
+          <w:p>
+            <w:r>
+              <w:t>Shipping:</w:t>
+            </w:r>
+          </w:p>
+        </w:tc>
+        <w:tc>
+          <w:tcPr>
+            <w:tcW w:w="0" w:type="auto"/>
+            <w:tcMar>
+              <w:top w:w="100" w:type="dxa"/>
+              <w:left w:w="100" w:type="dxa"/>
+              <w:bottom w:w="100" w:type="dxa"/>
+              <w:right w:w="100" w:type="dxa"/>
+            </w:tcMar>
+            <w:vAlign w:val="center"/>
+          </w:tcPr>
+          <w:p>
+            <w:r>
+              <w:t>$450.00</w:t>
             </w:r>
           </w:p>
         </w:tc>
@@ -1458,25 +1320,62 @@
         </w:tblPrEx>
         <w:tc>
           <w:tcPr>
-            <w:tcW w:w="3126" w:type="pct"/>
-            <w:tcBorders>
-              <w:top w:val="single" w:sz="1" w:space="0" w:color="auto"/>
-              <w:left w:val="single" w:sz="1" w:space="0" w:color="auto"/>
-              <w:bottom w:val="single" w:sz="1" w:space="0" w:color="auto"/>
-              <w:right w:val="single" w:sz="1" w:space="0" w:color="auto"/>
-            </w:tcBorders>
-            <w:vAlign w:val="center"/>
-          </w:tcPr>
-          <w:p>
-            <w:pPr>
-              <w:spacing w:before="60" w:after="60"/>
-            </w:pPr>
+            <w:tcW w:w="2409" w:type="pct"/>
+            <w:tcMar>
+              <w:top w:w="100" w:type="dxa"/>
+              <w:left w:w="100" w:type="dxa"/>
+              <w:bottom w:w="100" w:type="dxa"/>
+              <w:right w:w="100" w:type="dxa"/>
+            </w:tcMar>
+            <w:vAlign w:val="center"/>
+          </w:tcPr>
+          <w:p>
+            <w:r>
+              <w:t>Tax (6%):</w:t>
+            </w:r>
+          </w:p>
+        </w:tc>
+        <w:tc>
+          <w:tcPr>
+            <w:tcW w:w="0" w:type="auto"/>
+            <w:tcMar>
+              <w:top w:w="100" w:type="dxa"/>
+              <w:left w:w="100" w:type="dxa"/>
+              <w:bottom w:w="100" w:type="dxa"/>
+              <w:right w:w="100" w:type="dxa"/>
+            </w:tcMar>
+            <w:vAlign w:val="center"/>
+          </w:tcPr>
+          <w:p>
+            <w:r>
+              <w:t>$1,467.25</w:t>
+            </w:r>
+          </w:p>
+        </w:tc>
+      </w:tr>
+      <w:tr>
+        <w:tblPrEx>
+          <w:tblCellMar>
+            <w:top w:w="0" w:type="dxa"/>
+            <w:bottom w:w="0" w:type="dxa"/>
+          </w:tblCellMar>
+        </w:tblPrEx>
+        <w:tc>
+          <w:tcPr>
+            <w:tcW w:w="2409" w:type="pct"/>
+            <w:tcMar>
+              <w:top w:w="100" w:type="dxa"/>
+              <w:left w:w="100" w:type="dxa"/>
+              <w:bottom w:w="100" w:type="dxa"/>
+              <w:right w:w="100" w:type="dxa"/>
+            </w:tcMar>
+            <w:vAlign w:val="center"/>
+          </w:tcPr>
+          <w:p>
             <w:r>
               <w:rPr>
                 <w:b/>
                 <w:bCs/>
-                <w:sz w:val="22"/>
-                <w:szCs w:val="22"/>
               </w:rPr>
               <w:t>TOTAL:</w:t>
             </w:r>
@@ -1484,28 +1383,22 @@
         </w:tc>
         <w:tc>
           <w:tcPr>
-            <w:tcW w:w="1874" w:type="pct"/>
-            <w:tcBorders>
-              <w:top w:val="single" w:sz="1" w:space="0" w:color="auto"/>
-              <w:left w:val="single" w:sz="1" w:space="0" w:color="auto"/>
-              <w:bottom w:val="single" w:sz="1" w:space="0" w:color="auto"/>
-              <w:right w:val="single" w:sz="1" w:space="0" w:color="auto"/>
-            </w:tcBorders>
-            <w:vAlign w:val="center"/>
-          </w:tcPr>
-          <w:p>
-            <w:pPr>
-              <w:spacing w:before="60" w:after="60"/>
-              <w:jc w:val="right"/>
-            </w:pPr>
+            <w:tcW w:w="0" w:type="auto"/>
+            <w:tcMar>
+              <w:top w:w="100" w:type="dxa"/>
+              <w:left w:w="100" w:type="dxa"/>
+              <w:bottom w:w="100" w:type="dxa"/>
+              <w:right w:w="100" w:type="dxa"/>
+            </w:tcMar>
+            <w:vAlign w:val="center"/>
+          </w:tcPr>
+          <w:p>
             <w:r>
               <w:rPr>
                 <w:b/>
                 <w:bCs/>
-                <w:sz w:val="22"/>
-                <w:szCs w:val="22"/>
               </w:rPr>
-              <w:t>$26371.38</w:t>
+              <w:t>$26,371.37</w:t>
             </w:r>
           </w:p>
         </w:tc>
@@ -1513,7 +1406,12 @@
     </w:tbl>
     <w:p>
       <w:pPr>
-        <w:spacing w:before="240" w:after="120"/>
+        <w:spacing w:after="300"/>
+      </w:pPr>
+    </w:p>
+    <w:p>
+      <w:pPr>
+        <w:spacing w:after="200"/>
       </w:pPr>
       <w:r>
         <w:rPr>
@@ -1527,40 +1425,70 @@
     </w:p>
     <w:p>
       <w:pPr>
-        <w:spacing w:after="60"/>
+        <w:spacing w:after="150"/>
       </w:pPr>
       <w:r>
-        <w:t>All materials must be accompanied by mill test certificates. Delivery must be scheduled 48 hours in advance. Materials require quality inspection upon receipt.</w:t>
+        <w:t>1. All materials must be accompanied by mill test certificates</w:t>
       </w:r>
     </w:p>
     <w:p>
       <w:pPr>
-        <w:spacing w:after="120"/>
+        <w:spacing w:after="150"/>
       </w:pPr>
       <w:r>
-        <w:t>Bill of Materials (BOM) for each Material Number must be provided. BOMs must include Type/Part Designation and exact Dimensions for verification.</w:t>
+        <w:lastRenderedPageBreak/>
+        <w:t>2. Delivery must be scheduled 48 hours in advance</w:t>
       </w:r>
+    </w:p>
+    <w:p>
+      <w:pPr>
+        <w:spacing w:after="150"/>
+      </w:pPr>
+      <w:r>
+        <w:t>3. Materials require quality inspection upon receipt</w:t>
+      </w:r>
+    </w:p>
+    <w:p>
+      <w:pPr>
+        <w:spacing w:after="150"/>
+      </w:pPr>
+      <w:r>
+        <w:t>4. Bill of Materials (BOM) for each Material Number must be provided</w:t>
+      </w:r>
+    </w:p>
+    <w:p>
+      <w:pPr>
+        <w:spacing w:after="150"/>
+      </w:pPr>
+      <w:r>
+        <w:t>5. BOMs must include Type/Part Designation and exact Dimensions for verification</w:t>
+      </w:r>
+    </w:p>
+    <w:p>
+      <w:pPr>
+        <w:spacing w:after="300"/>
+      </w:pPr>
     </w:p>
     <w:tbl>
       <w:tblPr>
         <w:tblW w:w="5000" w:type="pct"/>
         <w:tblBorders>
-          <w:top w:val="single" w:sz="1" w:space="0" w:color="auto"/>
-          <w:left w:val="single" w:sz="1" w:space="0" w:color="auto"/>
-          <w:bottom w:val="single" w:sz="1" w:space="0" w:color="auto"/>
-          <w:right w:val="single" w:sz="1" w:space="0" w:color="auto"/>
-          <w:insideH w:val="single" w:sz="4" w:space="0" w:color="auto"/>
-          <w:insideV w:val="single" w:sz="4" w:space="0" w:color="auto"/>
+          <w:top w:val="single" w:sz="1" w:space="0" w:color="000000"/>
+          <w:left w:val="single" w:sz="1" w:space="0" w:color="000000"/>
+          <w:bottom w:val="single" w:sz="1" w:space="0" w:color="000000"/>
+          <w:right w:val="single" w:sz="1" w:space="0" w:color="000000"/>
+          <w:insideH w:val="single" w:sz="1" w:space="0" w:color="000000"/>
+          <w:insideV w:val="single" w:sz="1" w:space="0" w:color="000000"/>
         </w:tblBorders>
         <w:tblCellMar>
           <w:left w:w="10" w:type="dxa"/>
           <w:right w:w="10" w:type="dxa"/>
         </w:tblCellMar>
-        <w:tblLook w:val="04A0" w:firstRow="1" w:lastRow="0" w:firstColumn="1" w:lastColumn="0" w:noHBand="0" w:noVBand="1"/>
+        <w:tblLook w:val="0000" w:firstRow="0" w:lastRow="0" w:firstColumn="0" w:lastColumn="0" w:noHBand="0" w:noVBand="0"/>
       </w:tblPr>
       <w:tblGrid>
-        <w:gridCol w:w="4679"/>
-        <w:gridCol w:w="4679"/>
+        <w:gridCol w:w="4756"/>
+        <w:gridCol w:w="4602"/>
       </w:tblGrid>
       <w:tr>
         <w:tblPrEx>
@@ -1571,12 +1499,16 @@
         </w:tblPrEx>
         <w:tc>
           <w:tcPr>
-            <w:tcW w:w="2500" w:type="pct"/>
-          </w:tcPr>
-          <w:p>
-            <w:pPr>
-              <w:spacing w:after="120"/>
-            </w:pPr>
+            <w:tcW w:w="0" w:type="auto"/>
+            <w:tcMar>
+              <w:top w:w="100" w:type="dxa"/>
+              <w:left w:w="100" w:type="dxa"/>
+              <w:bottom w:w="100" w:type="dxa"/>
+              <w:right w:w="100" w:type="dxa"/>
+            </w:tcMar>
+            <w:vAlign w:val="center"/>
+          </w:tcPr>
+          <w:p>
             <w:r>
               <w:rPr>
                 <w:b/>
@@ -1585,40 +1517,19 @@
               <w:t>Prepared By:</w:t>
             </w:r>
           </w:p>
-          <w:p>
-            <w:pPr>
-              <w:spacing w:after="60"/>
-            </w:pPr>
-            <w:r>
-              <w:t>_______________________</w:t>
-            </w:r>
-          </w:p>
-          <w:p>
-            <w:pPr>
-              <w:spacing w:after="60"/>
-            </w:pPr>
-            <w:r>
-              <w:rPr>
-                <w:sz w:val="18"/>
-                <w:szCs w:val="18"/>
-              </w:rPr>
-              <w:t>Sales Representative</w:t>
-            </w:r>
-          </w:p>
-          <w:p>
-            <w:r>
-              <w:t>Date: _____________</w:t>
-            </w:r>
-          </w:p>
-        </w:tc>
-        <w:tc>
-          <w:tcPr>
-            <w:tcW w:w="2500" w:type="pct"/>
-          </w:tcPr>
-          <w:p>
-            <w:pPr>
-              <w:spacing w:after="120"/>
-            </w:pPr>
+        </w:tc>
+        <w:tc>
+          <w:tcPr>
+            <w:tcW w:w="0" w:type="auto"/>
+            <w:tcMar>
+              <w:top w:w="100" w:type="dxa"/>
+              <w:left w:w="100" w:type="dxa"/>
+              <w:bottom w:w="100" w:type="dxa"/>
+              <w:right w:w="100" w:type="dxa"/>
+            </w:tcMar>
+            <w:vAlign w:val="center"/>
+          </w:tcPr>
+          <w:p>
             <w:r>
               <w:rPr>
                 <w:b/>
@@ -1627,29 +1538,78 @@
               <w:t>Approved By:</w:t>
             </w:r>
           </w:p>
-          <w:p>
-            <w:pPr>
-              <w:spacing w:after="60"/>
-            </w:pPr>
-            <w:r>
-              <w:t>_______________________</w:t>
-            </w:r>
-          </w:p>
-          <w:p>
-            <w:pPr>
-              <w:spacing w:after="60"/>
-            </w:pPr>
-            <w:r>
-              <w:rPr>
-                <w:sz w:val="18"/>
-                <w:szCs w:val="18"/>
-              </w:rPr>
-              <w:t>Sales Manager</w:t>
-            </w:r>
-          </w:p>
-          <w:p>
-            <w:r>
-              <w:t>Date: _____________</w:t>
+        </w:tc>
+      </w:tr>
+      <w:tr>
+        <w:tblPrEx>
+          <w:tblCellMar>
+            <w:top w:w="0" w:type="dxa"/>
+            <w:bottom w:w="0" w:type="dxa"/>
+          </w:tblCellMar>
+        </w:tblPrEx>
+        <w:tc>
+          <w:tcPr>
+            <w:tcW w:w="0" w:type="auto"/>
+            <w:tcMar>
+              <w:top w:w="100" w:type="dxa"/>
+              <w:left w:w="100" w:type="dxa"/>
+              <w:bottom w:w="100" w:type="dxa"/>
+              <w:right w:w="100" w:type="dxa"/>
+            </w:tcMar>
+            <w:vAlign w:val="center"/>
+          </w:tcPr>
+          <w:p>
+            <w:r>
+              <w:t xml:space="preserve"> ________________________________</w:t>
+            </w:r>
+            <w:proofErr w:type="gramStart"/>
+            <w:r>
+              <w:t>_  Sales</w:t>
+            </w:r>
+            <w:proofErr w:type="gramEnd"/>
+            <w:r>
+              <w:t xml:space="preserve"> </w:t>
+            </w:r>
+            <w:proofErr w:type="gramStart"/>
+            <w:r>
+              <w:t>Representative  Date</w:t>
+            </w:r>
+            <w:proofErr w:type="gramEnd"/>
+            <w:r>
+              <w:t>: _______________</w:t>
+            </w:r>
+          </w:p>
+        </w:tc>
+        <w:tc>
+          <w:tcPr>
+            <w:tcW w:w="0" w:type="auto"/>
+            <w:tcMar>
+              <w:top w:w="100" w:type="dxa"/>
+              <w:left w:w="100" w:type="dxa"/>
+              <w:bottom w:w="100" w:type="dxa"/>
+              <w:right w:w="100" w:type="dxa"/>
+            </w:tcMar>
+            <w:vAlign w:val="center"/>
+          </w:tcPr>
+          <w:p>
+            <w:r>
+              <w:t xml:space="preserve"> ________________________________</w:t>
+            </w:r>
+            <w:proofErr w:type="gramStart"/>
+            <w:r>
+              <w:t>_  Sales</w:t>
+            </w:r>
+            <w:proofErr w:type="gramEnd"/>
+            <w:r>
+              <w:t xml:space="preserve"> </w:t>
+            </w:r>
+            <w:proofErr w:type="gramStart"/>
+            <w:r>
+              <w:t>Manager  Date</w:t>
+            </w:r>
+            <w:proofErr w:type="gramEnd"/>
+            <w:r>
+              <w:t>: _______________</w:t>
             </w:r>
           </w:p>
         </w:tc>
@@ -1657,20 +1617,28 @@
     </w:tbl>
     <w:p>
       <w:pPr>
-        <w:spacing w:before="180" w:after="60"/>
+        <w:spacing w:after="200"/>
+      </w:pPr>
+    </w:p>
+    <w:p>
+      <w:pPr>
+        <w:spacing w:after="100"/>
         <w:jc w:val="center"/>
       </w:pPr>
       <w:r>
         <w:rPr>
+          <w:i/>
+          <w:iCs/>
           <w:sz w:val="18"/>
           <w:szCs w:val="18"/>
         </w:rPr>
-        <w:lastRenderedPageBreak/>
         <w:t>This sales order is subject to Precision Steel &amp; Components Ltd.</w:t>
       </w:r>
       <w:proofErr w:type="gramStart"/>
       <w:r>
         <w:rPr>
+          <w:i/>
+          <w:iCs/>
           <w:sz w:val="18"/>
           <w:szCs w:val="18"/>
         </w:rPr>
@@ -1679,6 +1647,8 @@
       <w:proofErr w:type="gramEnd"/>
       <w:r>
         <w:rPr>
+          <w:i/>
+          <w:iCs/>
           <w:sz w:val="18"/>
           <w:szCs w:val="18"/>
         </w:rPr>
@@ -1687,7 +1657,6 @@
     </w:p>
     <w:p>
       <w:pPr>
-        <w:spacing w:after="120"/>
         <w:jc w:val="center"/>
       </w:pPr>
       <w:r>
@@ -1711,10 +1680,10 @@
 <file path=word/numbering.xml><?xml version="1.0" encoding="utf-8"?>
 <w:numbering xmlns:wpc="http://schemas.microsoft.com/office/word/2010/wordprocessingCanvas" xmlns:cx="http://schemas.microsoft.com/office/drawing/2014/chartex" xmlns:cx1="http://schemas.microsoft.com/office/drawing/2015/9/8/chartex" xmlns:cx2="http://schemas.microsoft.com/office/drawing/2015/10/21/chartex" xmlns:cx3="http://schemas.microsoft.com/office/drawing/2016/5/9/chartex" xmlns:cx4="http://schemas.microsoft.com/office/drawing/2016/5/10/chartex" xmlns:cx5="http://schemas.microsoft.com/office/drawing/2016/5/11/chartex" xmlns:cx6="http://schemas.microsoft.com/office/drawing/2016/5/12/chartex" xmlns:cx7="http://schemas.microsoft.com/office/drawing/2016/5/13/chartex" xmlns:cx8="http://schemas.microsoft.com/office/drawing/2016/5/14/chartex" xmlns:mc="http://schemas.openxmlformats.org/markup-compatibility/2006" xmlns:aink="http://schemas.microsoft.com/office/drawing/2016/ink" xmlns:am3d="http://schemas.microsoft.com/office/drawing/2017/model3d" xmlns:o="urn:schemas-microsoft-com:office:office" xmlns:oel="http://schemas.microsoft.com/office/2019/extlst" xmlns:r="http://schemas.openxmlformats.org/officeDocument/2006/relationships" xmlns:m="http://schemas.openxmlformats.org/officeDocument/2006/math" xmlns:v="urn:schemas-microsoft-com:vml" xmlns:wp14="http://schemas.microsoft.com/office/word/2010/wordprocessingDrawing" xmlns:wp="http://schemas.openxmlformats.org/drawingml/2006/wordprocessingDrawing" xmlns:w10="urn:schemas-microsoft-com:office:word" xmlns:w="http://schemas.openxmlformats.org/wordprocessingml/2006/main" xmlns:w14="http://schemas.microsoft.com/office/word/2010/wordml" xmlns:w15="http://schemas.microsoft.com/office/word/2012/wordml" xmlns:w16cex="http://schemas.microsoft.com/office/word/2018/wordml/cex" xmlns:w16cid="http://schemas.microsoft.com/office/word/2016/wordml/cid" xmlns:w16="http://schemas.microsoft.com/office/word/2018/wordml" xmlns:w16du="http://schemas.microsoft.com/office/word/2023/wordml/word16du" xmlns:w16sdtdh="http://schemas.microsoft.com/office/word/2020/wordml/sdtdatahash" xmlns:w16sdtfl="http://schemas.microsoft.com/office/word/2024/wordml/sdtformatlock" xmlns:w16se="http://schemas.microsoft.com/office/word/2015/wordml/symex" xmlns:wpg="http://schemas.microsoft.com/office/word/2010/wordprocessingGroup" xmlns:wpi="http://schemas.microsoft.com/office/word/2010/wordprocessingInk" xmlns:wne="http://schemas.microsoft.com/office/word/2006/wordml" xmlns:wps="http://schemas.microsoft.com/office/word/2010/wordprocessingShape" mc:Ignorable="w14 w15 w16se w16cid w16 w16cex w16sdtdh w16sdtfl w16du wp14">
   <w:abstractNum w:abstractNumId="0" w15:restartNumberingAfterBreak="0">
-    <w:nsid w:val="2AAC4D69"/>
+    <w:nsid w:val="05676AA1"/>
     <w:multiLevelType w:val="hybridMultilevel"/>
-    <w:tmpl w:val="85E89C16"/>
-    <w:lvl w:ilvl="0" w:tplc="93AE1D52">
+    <w:tmpl w:val="ECB2F2B2"/>
+    <w:lvl w:ilvl="0" w:tplc="32680F7C">
       <w:start w:val="1"/>
       <w:numFmt w:val="bullet"/>
       <w:lvlText w:val="●"/>
@@ -1723,7 +1692,7 @@
         <w:ind w:left="720" w:hanging="360"/>
       </w:pPr>
     </w:lvl>
-    <w:lvl w:ilvl="1" w:tplc="45C4E41C">
+    <w:lvl w:ilvl="1" w:tplc="5816C268">
       <w:start w:val="1"/>
       <w:numFmt w:val="bullet"/>
       <w:lvlText w:val="○"/>
@@ -1732,7 +1701,7 @@
         <w:ind w:left="1440" w:hanging="360"/>
       </w:pPr>
     </w:lvl>
-    <w:lvl w:ilvl="2" w:tplc="C3D2EC28">
+    <w:lvl w:ilvl="2" w:tplc="AA1EDA5E">
       <w:start w:val="1"/>
       <w:numFmt w:val="bullet"/>
       <w:lvlText w:val="■"/>
@@ -1741,7 +1710,7 @@
         <w:ind w:left="2160" w:hanging="360"/>
       </w:pPr>
     </w:lvl>
-    <w:lvl w:ilvl="3" w:tplc="663459D6">
+    <w:lvl w:ilvl="3" w:tplc="DCCE5196">
       <w:start w:val="1"/>
       <w:numFmt w:val="bullet"/>
       <w:lvlText w:val="●"/>
@@ -1750,7 +1719,7 @@
         <w:ind w:left="2880" w:hanging="360"/>
       </w:pPr>
     </w:lvl>
-    <w:lvl w:ilvl="4" w:tplc="DA42CE30">
+    <w:lvl w:ilvl="4" w:tplc="79DEC330">
       <w:start w:val="1"/>
       <w:numFmt w:val="bullet"/>
       <w:lvlText w:val="○"/>
@@ -1759,7 +1728,7 @@
         <w:ind w:left="3600" w:hanging="360"/>
       </w:pPr>
     </w:lvl>
-    <w:lvl w:ilvl="5" w:tplc="C4B01E30">
+    <w:lvl w:ilvl="5" w:tplc="B20053FA">
       <w:start w:val="1"/>
       <w:numFmt w:val="bullet"/>
       <w:lvlText w:val="■"/>
@@ -1768,7 +1737,7 @@
         <w:ind w:left="4320" w:hanging="360"/>
       </w:pPr>
     </w:lvl>
-    <w:lvl w:ilvl="6" w:tplc="72208FB8">
+    <w:lvl w:ilvl="6" w:tplc="0F1A9D6E">
       <w:start w:val="1"/>
       <w:numFmt w:val="bullet"/>
       <w:lvlText w:val="●"/>
@@ -1777,7 +1746,7 @@
         <w:ind w:left="5040" w:hanging="360"/>
       </w:pPr>
     </w:lvl>
-    <w:lvl w:ilvl="7" w:tplc="2C7E3DBA">
+    <w:lvl w:ilvl="7" w:tplc="FD4C072E">
       <w:start w:val="1"/>
       <w:numFmt w:val="bullet"/>
       <w:lvlText w:val="●"/>
@@ -1786,7 +1755,7 @@
         <w:ind w:left="5760" w:hanging="360"/>
       </w:pPr>
     </w:lvl>
-    <w:lvl w:ilvl="8" w:tplc="9D3EE5F2">
+    <w:lvl w:ilvl="8" w:tplc="C414CF6C">
       <w:start w:val="1"/>
       <w:numFmt w:val="bullet"/>
       <w:lvlText w:val="●"/>
@@ -1796,7 +1765,7 @@
       </w:pPr>
     </w:lvl>
   </w:abstractNum>
-  <w:num w:numId="1" w16cid:durableId="201671403">
+  <w:num w:numId="1" w16cid:durableId="176433037">
     <w:abstractNumId w:val="0"/>
     <w:lvlOverride w:ilvl="0">
       <w:startOverride w:val="1"/>

</xml_diff>